<commit_message>
Nav Bar Test added
</commit_message>
<xml_diff>
--- a/TestPlanTemplate.docx
+++ b/TestPlanTemplate.docx
@@ -5269,7 +5269,7 @@
                 <w:sz w:val="20"/>
                 <w:szCs w:val="20"/>
               </w:rPr>
-              <w:t>&lt;Enter an action&gt;</w:t>
+              <w:t>User clicks on About Us Link</w:t>
             </w:r>
           </w:p>
         </w:tc>
@@ -5303,7 +5303,7 @@
                 <w:sz w:val="20"/>
                 <w:szCs w:val="20"/>
               </w:rPr>
-              <w:t>&lt;Enter the expected results&gt;</w:t>
+              <w:t>User is sent to About Us Page Successfully</w:t>
             </w:r>
           </w:p>
         </w:tc>
@@ -5444,7 +5444,7 @@
                 <w:sz w:val="20"/>
                 <w:szCs w:val="20"/>
               </w:rPr>
-              <w:t>&lt;Enter an action&gt;</w:t>
+              <w:t>User clicks on Attractions Link</w:t>
             </w:r>
           </w:p>
         </w:tc>
@@ -5478,7 +5478,7 @@
                 <w:sz w:val="20"/>
                 <w:szCs w:val="20"/>
               </w:rPr>
-              <w:t>&lt;Enter the expected results&gt;</w:t>
+              <w:t>User is sent to Attractions Page Successfully</w:t>
             </w:r>
           </w:p>
         </w:tc>
@@ -5619,7 +5619,7 @@
                 <w:sz w:val="20"/>
                 <w:szCs w:val="20"/>
               </w:rPr>
-              <w:t>&lt;Enter an action&gt;</w:t>
+              <w:t>User clicks on Contact Us Link</w:t>
             </w:r>
           </w:p>
         </w:tc>
@@ -5653,7 +5653,7 @@
                 <w:sz w:val="20"/>
                 <w:szCs w:val="20"/>
               </w:rPr>
-              <w:t>&lt;Enter the expected results&gt;</w:t>
+              <w:t>User is sent to Contact Us Page Successfully</w:t>
             </w:r>
           </w:p>
         </w:tc>
@@ -5794,7 +5794,7 @@
                 <w:sz w:val="20"/>
                 <w:szCs w:val="20"/>
               </w:rPr>
-              <w:t>&lt;Enter an action&gt;</w:t>
+              <w:t>User clicks on Book Your Vacation Link</w:t>
             </w:r>
           </w:p>
         </w:tc>
@@ -5828,7 +5828,7 @@
                 <w:sz w:val="20"/>
                 <w:szCs w:val="20"/>
               </w:rPr>
-              <w:t>&lt;Enter the expected results&gt;</w:t>
+              <w:t>User is sent to the Booking Page Successfully</w:t>
             </w:r>
           </w:p>
         </w:tc>
@@ -5969,7 +5969,7 @@
                 <w:sz w:val="20"/>
                 <w:szCs w:val="20"/>
               </w:rPr>
-              <w:t>&lt;Enter an action&gt;</w:t>
+              <w:t>User clicks on Sign Up Link</w:t>
             </w:r>
           </w:p>
         </w:tc>
@@ -6003,7 +6003,7 @@
                 <w:sz w:val="20"/>
                 <w:szCs w:val="20"/>
               </w:rPr>
-              <w:t>&lt;Enter the expected results&gt;</w:t>
+              <w:t>User is sent to the Registration Page Successfully</w:t>
             </w:r>
           </w:p>
         </w:tc>
@@ -6711,8 +6711,20 @@
                 <w:sz w:val="20"/>
                 <w:szCs w:val="20"/>
               </w:rPr>
-              <w:t>&lt;Enter an action&gt;</w:t>
-            </w:r>
+              <w:t xml:space="preserve">User opens the Moffat Bay Lodge website by navigating to </w:t>
+            </w:r>
+            <w:proofErr w:type="spellStart"/>
+            <w:r>
+              <w:rPr>
+                <w:rFonts w:ascii="Arial" w:hAnsi="Arial" w:cs="Arial"/>
+                <w:b/>
+                <w:bCs/>
+                <w:sz w:val="20"/>
+                <w:szCs w:val="20"/>
+              </w:rPr>
+              <w:t>index.php</w:t>
+            </w:r>
+            <w:proofErr w:type="spellEnd"/>
           </w:p>
         </w:tc>
         <w:tc>
@@ -6745,7 +6757,7 @@
                 <w:sz w:val="20"/>
                 <w:szCs w:val="20"/>
               </w:rPr>
-              <w:t>&lt;Enter the expected results&gt;</w:t>
+              <w:t>The landing page loads successfully without displaying PHP errors, database errors, or a blank page.</w:t>
             </w:r>
           </w:p>
         </w:tc>
@@ -6852,6 +6864,7 @@
                 <w:sz w:val="20"/>
                 <w:szCs w:val="20"/>
               </w:rPr>
+              <w:lastRenderedPageBreak/>
               <w:t>2</w:t>
             </w:r>
           </w:p>
@@ -6886,7 +6899,7 @@
                 <w:sz w:val="20"/>
                 <w:szCs w:val="20"/>
               </w:rPr>
-              <w:t>&lt;Enter an action&gt;</w:t>
+              <w:t>User views the top section of the landing page</w:t>
             </w:r>
           </w:p>
         </w:tc>
@@ -6920,7 +6933,7 @@
                 <w:sz w:val="20"/>
                 <w:szCs w:val="20"/>
               </w:rPr>
-              <w:t>&lt;Enter the expected results&gt;</w:t>
+              <w:t>The Moffat Bay Lodge name, logo, or main page heading is displayed correctly and is clearly visible.</w:t>
             </w:r>
           </w:p>
         </w:tc>
@@ -7061,7 +7074,7 @@
                 <w:sz w:val="20"/>
                 <w:szCs w:val="20"/>
               </w:rPr>
-              <w:t>&lt;Enter an action&gt;</w:t>
+              <w:t>User reviews the main content displayed on the landing page.</w:t>
             </w:r>
           </w:p>
         </w:tc>
@@ -7095,7 +7108,7 @@
                 <w:sz w:val="20"/>
                 <w:szCs w:val="20"/>
               </w:rPr>
-              <w:t>&lt;Enter the expected results&gt;</w:t>
+              <w:t>The landing page displays the intended text, images, and information about Moffat Bay Lodge correctly without missing or broken content.</w:t>
             </w:r>
           </w:p>
         </w:tc>
@@ -7228,15 +7241,49 @@
                 <w:szCs w:val="20"/>
               </w:rPr>
             </w:pPr>
-            <w:r>
-              <w:rPr>
-                <w:rFonts w:ascii="Arial" w:hAnsi="Arial" w:cs="Arial"/>
-                <w:b/>
-                <w:bCs/>
-                <w:sz w:val="20"/>
-                <w:szCs w:val="20"/>
-              </w:rPr>
-              <w:t>&lt;Enter an action&gt;</w:t>
+            <w:proofErr w:type="gramStart"/>
+            <w:r>
+              <w:rPr>
+                <w:rFonts w:ascii="Arial" w:hAnsi="Arial" w:cs="Arial"/>
+                <w:b/>
+                <w:bCs/>
+                <w:sz w:val="20"/>
+                <w:szCs w:val="20"/>
+              </w:rPr>
+              <w:t>User</w:t>
+            </w:r>
+            <w:proofErr w:type="gramEnd"/>
+            <w:r>
+              <w:rPr>
+                <w:rFonts w:ascii="Arial" w:hAnsi="Arial" w:cs="Arial"/>
+                <w:b/>
+                <w:bCs/>
+                <w:sz w:val="20"/>
+                <w:szCs w:val="20"/>
+              </w:rPr>
+              <w:t xml:space="preserve"> </w:t>
+            </w:r>
+            <w:proofErr w:type="gramStart"/>
+            <w:r>
+              <w:rPr>
+                <w:rFonts w:ascii="Arial" w:hAnsi="Arial" w:cs="Arial"/>
+                <w:b/>
+                <w:bCs/>
+                <w:sz w:val="20"/>
+                <w:szCs w:val="20"/>
+              </w:rPr>
+              <w:t>scrolls</w:t>
+            </w:r>
+            <w:proofErr w:type="gramEnd"/>
+            <w:r>
+              <w:rPr>
+                <w:rFonts w:ascii="Arial" w:hAnsi="Arial" w:cs="Arial"/>
+                <w:b/>
+                <w:bCs/>
+                <w:sz w:val="20"/>
+                <w:szCs w:val="20"/>
+              </w:rPr>
+              <w:t xml:space="preserve"> from the top to the bottom of the landing page.</w:t>
             </w:r>
           </w:p>
         </w:tc>
@@ -7270,182 +7317,7 @@
                 <w:sz w:val="20"/>
                 <w:szCs w:val="20"/>
               </w:rPr>
-              <w:t>&lt;Enter the expected results&gt;</w:t>
-            </w:r>
-          </w:p>
-        </w:tc>
-        <w:tc>
-          <w:tcPr>
-            <w:tcW w:w="2148" w:type="dxa"/>
-            <w:tcBorders>
-              <w:top w:val="single" w:sz="4" w:space="0" w:color="auto"/>
-              <w:left w:val="single" w:sz="4" w:space="0" w:color="auto"/>
-              <w:bottom w:val="single" w:sz="4" w:space="0" w:color="auto"/>
-              <w:right w:val="single" w:sz="4" w:space="0" w:color="auto"/>
-            </w:tcBorders>
-            <w:hideMark/>
-          </w:tcPr>
-          <w:p>
-            <w:pPr>
-              <w:spacing w:after="160" w:line="259" w:lineRule="auto"/>
-              <w:rPr>
-                <w:rFonts w:ascii="Arial" w:hAnsi="Arial" w:cs="Arial"/>
-                <w:b/>
-                <w:bCs/>
-                <w:sz w:val="20"/>
-                <w:szCs w:val="20"/>
-              </w:rPr>
-            </w:pPr>
-            <w:r>
-              <w:rPr>
-                <w:rFonts w:ascii="Arial" w:hAnsi="Arial" w:cs="Arial"/>
-                <w:b/>
-                <w:bCs/>
-                <w:sz w:val="20"/>
-                <w:szCs w:val="20"/>
-              </w:rPr>
-              <w:t>&lt;yes/no&gt;</w:t>
-            </w:r>
-          </w:p>
-        </w:tc>
-        <w:tc>
-          <w:tcPr>
-            <w:tcW w:w="2052" w:type="dxa"/>
-            <w:tcBorders>
-              <w:top w:val="single" w:sz="4" w:space="0" w:color="auto"/>
-              <w:left w:val="single" w:sz="4" w:space="0" w:color="auto"/>
-              <w:bottom w:val="single" w:sz="4" w:space="0" w:color="auto"/>
-              <w:right w:val="single" w:sz="4" w:space="0" w:color="auto"/>
-            </w:tcBorders>
-            <w:hideMark/>
-          </w:tcPr>
-          <w:p>
-            <w:pPr>
-              <w:spacing w:after="160" w:line="259" w:lineRule="auto"/>
-              <w:rPr>
-                <w:rFonts w:ascii="Arial" w:hAnsi="Arial" w:cs="Arial"/>
-                <w:b/>
-                <w:bCs/>
-                <w:sz w:val="20"/>
-                <w:szCs w:val="20"/>
-              </w:rPr>
-            </w:pPr>
-            <w:r>
-              <w:rPr>
-                <w:rFonts w:ascii="Arial" w:hAnsi="Arial" w:cs="Arial"/>
-                <w:b/>
-                <w:bCs/>
-                <w:sz w:val="20"/>
-                <w:szCs w:val="20"/>
-              </w:rPr>
-              <w:t>&lt;yes/no&gt;</w:t>
-            </w:r>
-          </w:p>
-        </w:tc>
-      </w:tr>
-      <w:tr>
-        <w:trPr>
-          <w:trHeight w:val="350"/>
-        </w:trPr>
-        <w:tc>
-          <w:tcPr>
-            <w:tcW w:w="1250" w:type="dxa"/>
-            <w:tcBorders>
-              <w:top w:val="single" w:sz="4" w:space="0" w:color="auto"/>
-              <w:left w:val="single" w:sz="4" w:space="0" w:color="auto"/>
-              <w:bottom w:val="single" w:sz="4" w:space="0" w:color="auto"/>
-              <w:right w:val="single" w:sz="4" w:space="0" w:color="auto"/>
-            </w:tcBorders>
-            <w:hideMark/>
-          </w:tcPr>
-          <w:p>
-            <w:pPr>
-              <w:spacing w:after="160" w:line="259" w:lineRule="auto"/>
-              <w:rPr>
-                <w:rFonts w:ascii="Arial" w:hAnsi="Arial" w:cs="Arial"/>
-                <w:b/>
-                <w:bCs/>
-                <w:sz w:val="20"/>
-                <w:szCs w:val="20"/>
-              </w:rPr>
-            </w:pPr>
-            <w:r>
-              <w:rPr>
-                <w:rFonts w:ascii="Arial" w:hAnsi="Arial" w:cs="Arial"/>
-                <w:b/>
-                <w:bCs/>
-                <w:sz w:val="20"/>
-                <w:szCs w:val="20"/>
-              </w:rPr>
-              <w:t>5</w:t>
-            </w:r>
-          </w:p>
-        </w:tc>
-        <w:tc>
-          <w:tcPr>
-            <w:tcW w:w="3570" w:type="dxa"/>
-            <w:tcBorders>
-              <w:top w:val="single" w:sz="4" w:space="0" w:color="auto"/>
-              <w:left w:val="single" w:sz="4" w:space="0" w:color="auto"/>
-              <w:bottom w:val="single" w:sz="4" w:space="0" w:color="auto"/>
-              <w:right w:val="single" w:sz="4" w:space="0" w:color="auto"/>
-            </w:tcBorders>
-            <w:hideMark/>
-          </w:tcPr>
-          <w:p>
-            <w:pPr>
-              <w:spacing w:after="160" w:line="259" w:lineRule="auto"/>
-              <w:rPr>
-                <w:rFonts w:ascii="Arial" w:hAnsi="Arial" w:cs="Arial"/>
-                <w:b/>
-                <w:bCs/>
-                <w:sz w:val="20"/>
-                <w:szCs w:val="20"/>
-              </w:rPr>
-            </w:pPr>
-            <w:r>
-              <w:rPr>
-                <w:rFonts w:ascii="Arial" w:hAnsi="Arial" w:cs="Arial"/>
-                <w:b/>
-                <w:bCs/>
-                <w:sz w:val="20"/>
-                <w:szCs w:val="20"/>
-              </w:rPr>
-              <w:t>&lt;Enter an action&gt;</w:t>
-            </w:r>
-          </w:p>
-        </w:tc>
-        <w:tc>
-          <w:tcPr>
-            <w:tcW w:w="3930" w:type="dxa"/>
-            <w:tcBorders>
-              <w:top w:val="single" w:sz="4" w:space="0" w:color="auto"/>
-              <w:left w:val="single" w:sz="4" w:space="0" w:color="auto"/>
-              <w:bottom w:val="single" w:sz="4" w:space="0" w:color="auto"/>
-              <w:right w:val="single" w:sz="4" w:space="0" w:color="auto"/>
-            </w:tcBorders>
-            <w:hideMark/>
-          </w:tcPr>
-          <w:p>
-            <w:pPr>
-              <w:spacing w:after="160" w:line="259" w:lineRule="auto"/>
-              <w:rPr>
-                <w:rFonts w:ascii="Arial" w:hAnsi="Arial" w:cs="Arial"/>
-                <w:b/>
-                <w:bCs/>
-                <w:sz w:val="20"/>
-                <w:szCs w:val="20"/>
-              </w:rPr>
-            </w:pPr>
-            <w:r>
-              <w:rPr>
-                <w:rFonts w:ascii="Arial" w:hAnsi="Arial" w:cs="Arial"/>
-                <w:b/>
-                <w:bCs/>
-                <w:sz w:val="20"/>
-                <w:szCs w:val="20"/>
-              </w:rPr>
-              <w:t>&lt;Enter the expected results&gt;</w:t>
+              <w:t>All sections of the landing page display correctly, images load properly, and the page can be viewed without overlapping or improperly formatted content.</w:t>
             </w:r>
           </w:p>
         </w:tc>
@@ -8644,6 +8516,7 @@
                 <w:sz w:val="20"/>
                 <w:szCs w:val="20"/>
               </w:rPr>
+              <w:lastRenderedPageBreak/>
               <w:t>4</w:t>
             </w:r>
           </w:p>
@@ -9410,7 +9283,6 @@
                 <w:sz w:val="20"/>
                 <w:szCs w:val="20"/>
               </w:rPr>
-              <w:lastRenderedPageBreak/>
               <w:t>Step</w:t>
             </w:r>
           </w:p>
@@ -10640,6 +10512,7 @@
                 <w:sz w:val="20"/>
                 <w:szCs w:val="20"/>
               </w:rPr>
+              <w:lastRenderedPageBreak/>
               <w:t>Test 7</w:t>
             </w:r>
           </w:p>
@@ -11480,7 +11353,6 @@
                 <w:sz w:val="20"/>
                 <w:szCs w:val="20"/>
               </w:rPr>
-              <w:lastRenderedPageBreak/>
               <w:t>3</w:t>
             </w:r>
           </w:p>

</xml_diff>

<commit_message>
new Landing page test
</commit_message>
<xml_diff>
--- a/TestPlanTemplate.docx
+++ b/TestPlanTemplate.docx
@@ -1330,29 +1330,7 @@
           <w:sz w:val="20"/>
           <w:szCs w:val="20"/>
         </w:rPr>
-        <w:t xml:space="preserve"> should:  provide a test description, a test objective, the </w:t>
-      </w:r>
-      <w:proofErr w:type="gramStart"/>
-      <w:r>
-        <w:rPr>
-          <w:rFonts w:ascii="Arial" w:hAnsi="Arial" w:cs="Arial"/>
-          <w:b/>
-          <w:bCs/>
-          <w:sz w:val="20"/>
-          <w:szCs w:val="20"/>
-        </w:rPr>
-        <w:t>developer</w:t>
-      </w:r>
-      <w:proofErr w:type="gramEnd"/>
-      <w:r>
-        <w:rPr>
-          <w:rFonts w:ascii="Arial" w:hAnsi="Arial" w:cs="Arial"/>
-          <w:b/>
-          <w:bCs/>
-          <w:sz w:val="20"/>
-          <w:szCs w:val="20"/>
-        </w:rPr>
-        <w:t xml:space="preserve"> name and date tested. For each step, fill out the actions to be taken and describe the expected results, and indicate yes or no for each step depending upon the result. The </w:t>
+        <w:t xml:space="preserve"> should:  provide a test description, a test objective, the developer name and date tested. For each step, fill out the actions to be taken and describe the expected results, and indicate yes or no for each step depending upon the result. The </w:t>
       </w:r>
       <w:r>
         <w:rPr>
@@ -1533,29 +1511,7 @@
                 <w:sz w:val="20"/>
                 <w:szCs w:val="20"/>
               </w:rPr>
-              <w:t xml:space="preserve">Test Objective: User </w:t>
-            </w:r>
-            <w:proofErr w:type="gramStart"/>
-            <w:r>
-              <w:rPr>
-                <w:rFonts w:ascii="Arial" w:hAnsi="Arial" w:cs="Arial"/>
-                <w:b/>
-                <w:bCs/>
-                <w:sz w:val="20"/>
-                <w:szCs w:val="20"/>
-              </w:rPr>
-              <w:t>is able to</w:t>
-            </w:r>
-            <w:proofErr w:type="gramEnd"/>
-            <w:r>
-              <w:rPr>
-                <w:rFonts w:ascii="Arial" w:hAnsi="Arial" w:cs="Arial"/>
-                <w:b/>
-                <w:bCs/>
-                <w:sz w:val="20"/>
-                <w:szCs w:val="20"/>
-              </w:rPr>
-              <w:t xml:space="preserve"> input data for registration and data is saved to database when submit is clicked</w:t>
+              <w:t>Test Objective: User is able to input data for registration and data is saved to database when submit is clicked</w:t>
             </w:r>
           </w:p>
         </w:tc>
@@ -1611,29 +1567,7 @@
                 <w:sz w:val="20"/>
                 <w:szCs w:val="20"/>
               </w:rPr>
-              <w:t>Date tested: &lt;</w:t>
-            </w:r>
-            <w:proofErr w:type="spellStart"/>
-            <w:r>
-              <w:rPr>
-                <w:rFonts w:ascii="Arial" w:hAnsi="Arial" w:cs="Arial"/>
-                <w:b/>
-                <w:bCs/>
-                <w:sz w:val="20"/>
-                <w:szCs w:val="20"/>
-              </w:rPr>
-              <w:t>yyyy</w:t>
-            </w:r>
-            <w:proofErr w:type="spellEnd"/>
-            <w:r>
-              <w:rPr>
-                <w:rFonts w:ascii="Arial" w:hAnsi="Arial" w:cs="Arial"/>
-                <w:b/>
-                <w:bCs/>
-                <w:sz w:val="20"/>
-                <w:szCs w:val="20"/>
-              </w:rPr>
-              <w:t xml:space="preserve">/mm/dd&gt; </w:t>
+              <w:t xml:space="preserve">Date tested: &lt;yyyy/mm/dd&gt; </w:t>
             </w:r>
           </w:p>
         </w:tc>
@@ -1690,29 +1624,7 @@
                 <w:sz w:val="20"/>
                 <w:szCs w:val="20"/>
               </w:rPr>
-              <w:t>Date tested: &lt;</w:t>
-            </w:r>
-            <w:proofErr w:type="spellStart"/>
-            <w:r>
-              <w:rPr>
-                <w:rFonts w:ascii="Arial" w:hAnsi="Arial" w:cs="Arial"/>
-                <w:b/>
-                <w:bCs/>
-                <w:sz w:val="20"/>
-                <w:szCs w:val="20"/>
-              </w:rPr>
-              <w:t>yyyy</w:t>
-            </w:r>
-            <w:proofErr w:type="spellEnd"/>
-            <w:r>
-              <w:rPr>
-                <w:rFonts w:ascii="Arial" w:hAnsi="Arial" w:cs="Arial"/>
-                <w:b/>
-                <w:bCs/>
-                <w:sz w:val="20"/>
-                <w:szCs w:val="20"/>
-              </w:rPr>
-              <w:t>/mm/dd&gt;</w:t>
+              <w:t>Date tested: &lt;yyyy/mm/dd&gt;</w:t>
             </w:r>
           </w:p>
         </w:tc>
@@ -3346,51 +3258,7 @@
                 <w:sz w:val="20"/>
                 <w:szCs w:val="20"/>
               </w:rPr>
-              <w:t xml:space="preserve">Test Objective: User </w:t>
-            </w:r>
-            <w:proofErr w:type="gramStart"/>
-            <w:r>
-              <w:rPr>
-                <w:rFonts w:ascii="Arial" w:hAnsi="Arial" w:cs="Arial"/>
-                <w:b/>
-                <w:bCs/>
-                <w:sz w:val="20"/>
-                <w:szCs w:val="20"/>
-              </w:rPr>
-              <w:t>is able to</w:t>
-            </w:r>
-            <w:proofErr w:type="gramEnd"/>
-            <w:r>
-              <w:rPr>
-                <w:rFonts w:ascii="Arial" w:hAnsi="Arial" w:cs="Arial"/>
-                <w:b/>
-                <w:bCs/>
-                <w:sz w:val="20"/>
-                <w:szCs w:val="20"/>
-              </w:rPr>
-              <w:t xml:space="preserve"> Login and data is retrieved </w:t>
-            </w:r>
-            <w:proofErr w:type="gramStart"/>
-            <w:r>
-              <w:rPr>
-                <w:rFonts w:ascii="Arial" w:hAnsi="Arial" w:cs="Arial"/>
-                <w:b/>
-                <w:bCs/>
-                <w:sz w:val="20"/>
-                <w:szCs w:val="20"/>
-              </w:rPr>
-              <w:t>from  database</w:t>
-            </w:r>
-            <w:proofErr w:type="gramEnd"/>
-            <w:r>
-              <w:rPr>
-                <w:rFonts w:ascii="Arial" w:hAnsi="Arial" w:cs="Arial"/>
-                <w:b/>
-                <w:bCs/>
-                <w:sz w:val="20"/>
-                <w:szCs w:val="20"/>
-              </w:rPr>
-              <w:t xml:space="preserve"> successfully</w:t>
+              <w:t>Test Objective: User is able to Login and data is retrieved from  database successfully</w:t>
             </w:r>
           </w:p>
         </w:tc>
@@ -3446,29 +3314,7 @@
                 <w:sz w:val="20"/>
                 <w:szCs w:val="20"/>
               </w:rPr>
-              <w:t>Date tested: &lt;</w:t>
-            </w:r>
-            <w:proofErr w:type="spellStart"/>
-            <w:r>
-              <w:rPr>
-                <w:rFonts w:ascii="Arial" w:hAnsi="Arial" w:cs="Arial"/>
-                <w:b/>
-                <w:bCs/>
-                <w:sz w:val="20"/>
-                <w:szCs w:val="20"/>
-              </w:rPr>
-              <w:t>yyyy</w:t>
-            </w:r>
-            <w:proofErr w:type="spellEnd"/>
-            <w:r>
-              <w:rPr>
-                <w:rFonts w:ascii="Arial" w:hAnsi="Arial" w:cs="Arial"/>
-                <w:b/>
-                <w:bCs/>
-                <w:sz w:val="20"/>
-                <w:szCs w:val="20"/>
-              </w:rPr>
-              <w:t xml:space="preserve">/mm/dd&gt; </w:t>
+              <w:t xml:space="preserve">Date tested: &lt;yyyy/mm/dd&gt; </w:t>
             </w:r>
           </w:p>
         </w:tc>
@@ -3525,29 +3371,7 @@
                 <w:sz w:val="20"/>
                 <w:szCs w:val="20"/>
               </w:rPr>
-              <w:t>Date tested: &lt;</w:t>
-            </w:r>
-            <w:proofErr w:type="spellStart"/>
-            <w:r>
-              <w:rPr>
-                <w:rFonts w:ascii="Arial" w:hAnsi="Arial" w:cs="Arial"/>
-                <w:b/>
-                <w:bCs/>
-                <w:sz w:val="20"/>
-                <w:szCs w:val="20"/>
-              </w:rPr>
-              <w:t>yyyy</w:t>
-            </w:r>
-            <w:proofErr w:type="spellEnd"/>
-            <w:r>
-              <w:rPr>
-                <w:rFonts w:ascii="Arial" w:hAnsi="Arial" w:cs="Arial"/>
-                <w:b/>
-                <w:bCs/>
-                <w:sz w:val="20"/>
-                <w:szCs w:val="20"/>
-              </w:rPr>
-              <w:t>/mm/dd&gt;</w:t>
+              <w:t>Date tested: &lt;yyyy/mm/dd&gt;</w:t>
             </w:r>
           </w:p>
         </w:tc>
@@ -4179,29 +4003,7 @@
                 <w:sz w:val="20"/>
                 <w:szCs w:val="20"/>
               </w:rPr>
-              <w:t xml:space="preserve">Login is submitted </w:t>
-            </w:r>
-            <w:proofErr w:type="gramStart"/>
-            <w:r>
-              <w:rPr>
-                <w:rFonts w:ascii="Arial" w:hAnsi="Arial" w:cs="Arial"/>
-                <w:b/>
-                <w:bCs/>
-                <w:sz w:val="20"/>
-                <w:szCs w:val="20"/>
-              </w:rPr>
-              <w:t>successfully,</w:t>
-            </w:r>
-            <w:proofErr w:type="gramEnd"/>
-            <w:r>
-              <w:rPr>
-                <w:rFonts w:ascii="Arial" w:hAnsi="Arial" w:cs="Arial"/>
-                <w:b/>
-                <w:bCs/>
-                <w:sz w:val="20"/>
-                <w:szCs w:val="20"/>
-              </w:rPr>
-              <w:t xml:space="preserve"> a success message is displayed</w:t>
+              <w:t>Login is submitted successfully, a success message is displayed</w:t>
             </w:r>
           </w:p>
         </w:tc>
@@ -4864,7 +4666,17 @@
                 <w:sz w:val="20"/>
                 <w:szCs w:val="20"/>
               </w:rPr>
-              <w:t>Test Objective: Nav Bar Links are clickable and send you to the intended site</w:t>
+              <w:t xml:space="preserve">Test Objective: </w:t>
+            </w:r>
+            <w:r>
+              <w:rPr>
+                <w:rFonts w:ascii="Arial" w:hAnsi="Arial" w:cs="Arial"/>
+                <w:b/>
+                <w:bCs/>
+                <w:sz w:val="20"/>
+                <w:szCs w:val="20"/>
+              </w:rPr>
+              <w:t>Landing Page Links Test</w:t>
             </w:r>
           </w:p>
         </w:tc>
@@ -4920,29 +4732,7 @@
                 <w:sz w:val="20"/>
                 <w:szCs w:val="20"/>
               </w:rPr>
-              <w:t>Date tested: &lt;</w:t>
-            </w:r>
-            <w:proofErr w:type="spellStart"/>
-            <w:r>
-              <w:rPr>
-                <w:rFonts w:ascii="Arial" w:hAnsi="Arial" w:cs="Arial"/>
-                <w:b/>
-                <w:bCs/>
-                <w:sz w:val="20"/>
-                <w:szCs w:val="20"/>
-              </w:rPr>
-              <w:t>yyyy</w:t>
-            </w:r>
-            <w:proofErr w:type="spellEnd"/>
-            <w:r>
-              <w:rPr>
-                <w:rFonts w:ascii="Arial" w:hAnsi="Arial" w:cs="Arial"/>
-                <w:b/>
-                <w:bCs/>
-                <w:sz w:val="20"/>
-                <w:szCs w:val="20"/>
-              </w:rPr>
-              <w:t xml:space="preserve">/mm/dd&gt; </w:t>
+              <w:t xml:space="preserve">Date tested: &lt;yyyy/mm/dd&gt; </w:t>
             </w:r>
           </w:p>
         </w:tc>
@@ -4999,29 +4789,7 @@
                 <w:sz w:val="20"/>
                 <w:szCs w:val="20"/>
               </w:rPr>
-              <w:t>Date tested: &lt;</w:t>
-            </w:r>
-            <w:proofErr w:type="spellStart"/>
-            <w:r>
-              <w:rPr>
-                <w:rFonts w:ascii="Arial" w:hAnsi="Arial" w:cs="Arial"/>
-                <w:b/>
-                <w:bCs/>
-                <w:sz w:val="20"/>
-                <w:szCs w:val="20"/>
-              </w:rPr>
-              <w:t>yyyy</w:t>
-            </w:r>
-            <w:proofErr w:type="spellEnd"/>
-            <w:r>
-              <w:rPr>
-                <w:rFonts w:ascii="Arial" w:hAnsi="Arial" w:cs="Arial"/>
-                <w:b/>
-                <w:bCs/>
-                <w:sz w:val="20"/>
-                <w:szCs w:val="20"/>
-              </w:rPr>
-              <w:t>/mm/dd&gt;</w:t>
+              <w:t>Date tested: &lt;yyyy/mm/dd&gt;</w:t>
             </w:r>
           </w:p>
         </w:tc>
@@ -5269,7 +5037,7 @@
                 <w:sz w:val="20"/>
                 <w:szCs w:val="20"/>
               </w:rPr>
-              <w:t>User clicks on About Us Link</w:t>
+              <w:t>User Navigates to Landing Page</w:t>
             </w:r>
           </w:p>
         </w:tc>
@@ -5303,7 +5071,7 @@
                 <w:sz w:val="20"/>
                 <w:szCs w:val="20"/>
               </w:rPr>
-              <w:t>User is sent to About Us Page Successfully</w:t>
+              <w:t>User successfully loads the Landing Page(index.php)</w:t>
             </w:r>
           </w:p>
         </w:tc>
@@ -5444,7 +5212,7 @@
                 <w:sz w:val="20"/>
                 <w:szCs w:val="20"/>
               </w:rPr>
-              <w:t>User clicks on Attractions Link</w:t>
+              <w:t>User Scrolls Down to the Create an account and book your vacation button and clicks on it</w:t>
             </w:r>
           </w:p>
         </w:tc>
@@ -5478,7 +5246,7 @@
                 <w:sz w:val="20"/>
                 <w:szCs w:val="20"/>
               </w:rPr>
-              <w:t>User is sent to Attractions Page Successfully</w:t>
+              <w:t>User clicks on button and is sent to login page</w:t>
             </w:r>
           </w:p>
         </w:tc>
@@ -5619,7 +5387,7 @@
                 <w:sz w:val="20"/>
                 <w:szCs w:val="20"/>
               </w:rPr>
-              <w:t>User clicks on Contact Us Link</w:t>
+              <w:t>User navigates back to the landing page scrolls down to the Access the Marina button and clicks on it</w:t>
             </w:r>
           </w:p>
         </w:tc>
@@ -5653,7 +5421,7 @@
                 <w:sz w:val="20"/>
                 <w:szCs w:val="20"/>
               </w:rPr>
-              <w:t>User is sent to Contact Us Page Successfully</w:t>
+              <w:t>User successfully navigates back to the Landing page and when the button is clicked is sent to the top of the landing page.</w:t>
             </w:r>
           </w:p>
         </w:tc>
@@ -5794,7 +5562,7 @@
                 <w:sz w:val="20"/>
                 <w:szCs w:val="20"/>
               </w:rPr>
-              <w:t>User clicks on Book Your Vacation Link</w:t>
+              <w:t>User Scrools down to the Attractions Link and clicks on it</w:t>
             </w:r>
           </w:p>
         </w:tc>
@@ -5828,7 +5596,7 @@
                 <w:sz w:val="20"/>
                 <w:szCs w:val="20"/>
               </w:rPr>
-              <w:t>User is sent to the Booking Page Successfully</w:t>
+              <w:t>User is sent to the Attraction Page</w:t>
             </w:r>
           </w:p>
         </w:tc>
@@ -5969,7 +5737,7 @@
                 <w:sz w:val="20"/>
                 <w:szCs w:val="20"/>
               </w:rPr>
-              <w:t>User clicks on Sign Up Link</w:t>
+              <w:t>User Navigates back to the landing page scrolls down to the bottom and clicks back to top of page</w:t>
             </w:r>
           </w:p>
         </w:tc>
@@ -6003,7 +5771,7 @@
                 <w:sz w:val="20"/>
                 <w:szCs w:val="20"/>
               </w:rPr>
-              <w:t>User is sent to the Registration Page Successfully</w:t>
+              <w:t>User successfully navigates back to the landing page and when the button is clicked, User is sent to the top of landing page.</w:t>
             </w:r>
           </w:p>
         </w:tc>
@@ -6362,29 +6130,7 @@
                 <w:sz w:val="20"/>
                 <w:szCs w:val="20"/>
               </w:rPr>
-              <w:t>Date tested: &lt;</w:t>
-            </w:r>
-            <w:proofErr w:type="spellStart"/>
-            <w:r>
-              <w:rPr>
-                <w:rFonts w:ascii="Arial" w:hAnsi="Arial" w:cs="Arial"/>
-                <w:b/>
-                <w:bCs/>
-                <w:sz w:val="20"/>
-                <w:szCs w:val="20"/>
-              </w:rPr>
-              <w:t>yyyy</w:t>
-            </w:r>
-            <w:proofErr w:type="spellEnd"/>
-            <w:r>
-              <w:rPr>
-                <w:rFonts w:ascii="Arial" w:hAnsi="Arial" w:cs="Arial"/>
-                <w:b/>
-                <w:bCs/>
-                <w:sz w:val="20"/>
-                <w:szCs w:val="20"/>
-              </w:rPr>
-              <w:t xml:space="preserve">/mm/dd&gt; </w:t>
+              <w:t xml:space="preserve">Date tested: &lt;yyyy/mm/dd&gt; </w:t>
             </w:r>
           </w:p>
         </w:tc>
@@ -6441,29 +6187,7 @@
                 <w:sz w:val="20"/>
                 <w:szCs w:val="20"/>
               </w:rPr>
-              <w:t>Date tested: &lt;</w:t>
-            </w:r>
-            <w:proofErr w:type="spellStart"/>
-            <w:r>
-              <w:rPr>
-                <w:rFonts w:ascii="Arial" w:hAnsi="Arial" w:cs="Arial"/>
-                <w:b/>
-                <w:bCs/>
-                <w:sz w:val="20"/>
-                <w:szCs w:val="20"/>
-              </w:rPr>
-              <w:t>yyyy</w:t>
-            </w:r>
-            <w:proofErr w:type="spellEnd"/>
-            <w:r>
-              <w:rPr>
-                <w:rFonts w:ascii="Arial" w:hAnsi="Arial" w:cs="Arial"/>
-                <w:b/>
-                <w:bCs/>
-                <w:sz w:val="20"/>
-                <w:szCs w:val="20"/>
-              </w:rPr>
-              <w:t>/mm/dd&gt;</w:t>
+              <w:t>Date tested: &lt;yyyy/mm/dd&gt;</w:t>
             </w:r>
           </w:p>
         </w:tc>
@@ -6677,6 +6401,7 @@
                 <w:sz w:val="20"/>
                 <w:szCs w:val="20"/>
               </w:rPr>
+              <w:lastRenderedPageBreak/>
               <w:t>1</w:t>
             </w:r>
           </w:p>
@@ -6711,20 +6436,8 @@
                 <w:sz w:val="20"/>
                 <w:szCs w:val="20"/>
               </w:rPr>
-              <w:t xml:space="preserve">User opens the Moffat Bay Lodge website by navigating to </w:t>
-            </w:r>
-            <w:proofErr w:type="spellStart"/>
-            <w:r>
-              <w:rPr>
-                <w:rFonts w:ascii="Arial" w:hAnsi="Arial" w:cs="Arial"/>
-                <w:b/>
-                <w:bCs/>
-                <w:sz w:val="20"/>
-                <w:szCs w:val="20"/>
-              </w:rPr>
-              <w:t>index.php</w:t>
-            </w:r>
-            <w:proofErr w:type="spellEnd"/>
+              <w:t>User opens the Moffat Bay Lodge website by navigating to index.php</w:t>
+            </w:r>
           </w:p>
         </w:tc>
         <w:tc>
@@ -6864,7 +6577,6 @@
                 <w:sz w:val="20"/>
                 <w:szCs w:val="20"/>
               </w:rPr>
-              <w:lastRenderedPageBreak/>
               <w:t>2</w:t>
             </w:r>
           </w:p>
@@ -7241,49 +6953,15 @@
                 <w:szCs w:val="20"/>
               </w:rPr>
             </w:pPr>
-            <w:proofErr w:type="gramStart"/>
-            <w:r>
-              <w:rPr>
-                <w:rFonts w:ascii="Arial" w:hAnsi="Arial" w:cs="Arial"/>
-                <w:b/>
-                <w:bCs/>
-                <w:sz w:val="20"/>
-                <w:szCs w:val="20"/>
-              </w:rPr>
-              <w:t>User</w:t>
-            </w:r>
-            <w:proofErr w:type="gramEnd"/>
-            <w:r>
-              <w:rPr>
-                <w:rFonts w:ascii="Arial" w:hAnsi="Arial" w:cs="Arial"/>
-                <w:b/>
-                <w:bCs/>
-                <w:sz w:val="20"/>
-                <w:szCs w:val="20"/>
-              </w:rPr>
-              <w:t xml:space="preserve"> </w:t>
-            </w:r>
-            <w:proofErr w:type="gramStart"/>
-            <w:r>
-              <w:rPr>
-                <w:rFonts w:ascii="Arial" w:hAnsi="Arial" w:cs="Arial"/>
-                <w:b/>
-                <w:bCs/>
-                <w:sz w:val="20"/>
-                <w:szCs w:val="20"/>
-              </w:rPr>
-              <w:t>scrolls</w:t>
-            </w:r>
-            <w:proofErr w:type="gramEnd"/>
-            <w:r>
-              <w:rPr>
-                <w:rFonts w:ascii="Arial" w:hAnsi="Arial" w:cs="Arial"/>
-                <w:b/>
-                <w:bCs/>
-                <w:sz w:val="20"/>
-                <w:szCs w:val="20"/>
-              </w:rPr>
-              <w:t xml:space="preserve"> from the top to the bottom of the landing page.</w:t>
+            <w:r>
+              <w:rPr>
+                <w:rFonts w:ascii="Arial" w:hAnsi="Arial" w:cs="Arial"/>
+                <w:b/>
+                <w:bCs/>
+                <w:sz w:val="20"/>
+                <w:szCs w:val="20"/>
+              </w:rPr>
+              <w:t>User scrolls from the top to the bottom of the landing page.</w:t>
             </w:r>
           </w:p>
         </w:tc>
@@ -7676,29 +7354,7 @@
                 <w:sz w:val="20"/>
                 <w:szCs w:val="20"/>
               </w:rPr>
-              <w:t>Date tested: &lt;</w:t>
-            </w:r>
-            <w:proofErr w:type="spellStart"/>
-            <w:r>
-              <w:rPr>
-                <w:rFonts w:ascii="Arial" w:hAnsi="Arial" w:cs="Arial"/>
-                <w:b/>
-                <w:bCs/>
-                <w:sz w:val="20"/>
-                <w:szCs w:val="20"/>
-              </w:rPr>
-              <w:t>yyyy</w:t>
-            </w:r>
-            <w:proofErr w:type="spellEnd"/>
-            <w:r>
-              <w:rPr>
-                <w:rFonts w:ascii="Arial" w:hAnsi="Arial" w:cs="Arial"/>
-                <w:b/>
-                <w:bCs/>
-                <w:sz w:val="20"/>
-                <w:szCs w:val="20"/>
-              </w:rPr>
-              <w:t xml:space="preserve">/mm/dd&gt; </w:t>
+              <w:t xml:space="preserve">Date tested: &lt;yyyy/mm/dd&gt; </w:t>
             </w:r>
           </w:p>
         </w:tc>
@@ -7755,29 +7411,7 @@
                 <w:sz w:val="20"/>
                 <w:szCs w:val="20"/>
               </w:rPr>
-              <w:t>Date tested: &lt;</w:t>
-            </w:r>
-            <w:proofErr w:type="spellStart"/>
-            <w:r>
-              <w:rPr>
-                <w:rFonts w:ascii="Arial" w:hAnsi="Arial" w:cs="Arial"/>
-                <w:b/>
-                <w:bCs/>
-                <w:sz w:val="20"/>
-                <w:szCs w:val="20"/>
-              </w:rPr>
-              <w:t>yyyy</w:t>
-            </w:r>
-            <w:proofErr w:type="spellEnd"/>
-            <w:r>
-              <w:rPr>
-                <w:rFonts w:ascii="Arial" w:hAnsi="Arial" w:cs="Arial"/>
-                <w:b/>
-                <w:bCs/>
-                <w:sz w:val="20"/>
-                <w:szCs w:val="20"/>
-              </w:rPr>
-              <w:t>/mm/dd&gt;</w:t>
+              <w:t>Date tested: &lt;yyyy/mm/dd&gt;</w:t>
             </w:r>
           </w:p>
         </w:tc>
@@ -8341,6 +7975,7 @@
                 <w:sz w:val="20"/>
                 <w:szCs w:val="20"/>
               </w:rPr>
+              <w:lastRenderedPageBreak/>
               <w:t>3</w:t>
             </w:r>
           </w:p>
@@ -8516,7 +8151,6 @@
                 <w:sz w:val="20"/>
                 <w:szCs w:val="20"/>
               </w:rPr>
-              <w:lastRenderedPageBreak/>
               <w:t>4</w:t>
             </w:r>
           </w:p>
@@ -8585,31 +8219,7 @@
                 <w:sz w:val="20"/>
                 <w:szCs w:val="20"/>
               </w:rPr>
-              <w:t xml:space="preserve">Missing information is displayed correctly in </w:t>
-            </w:r>
-            <w:proofErr w:type="spellStart"/>
-            <w:proofErr w:type="gramStart"/>
-            <w:r>
-              <w:rPr>
-                <w:rFonts w:ascii="Arial" w:hAnsi="Arial" w:cs="Arial"/>
-                <w:b/>
-                <w:bCs/>
-                <w:sz w:val="20"/>
-                <w:szCs w:val="20"/>
-              </w:rPr>
-              <w:t>there</w:t>
-            </w:r>
-            <w:proofErr w:type="spellEnd"/>
-            <w:proofErr w:type="gramEnd"/>
-            <w:r>
-              <w:rPr>
-                <w:rFonts w:ascii="Arial" w:hAnsi="Arial" w:cs="Arial"/>
-                <w:b/>
-                <w:bCs/>
-                <w:sz w:val="20"/>
-                <w:szCs w:val="20"/>
-              </w:rPr>
-              <w:t xml:space="preserve"> respective fields</w:t>
+              <w:t>Missing information is displayed correctly in there respective fields</w:t>
             </w:r>
           </w:p>
         </w:tc>
@@ -8990,7 +8600,17 @@
                 <w:sz w:val="20"/>
                 <w:szCs w:val="20"/>
               </w:rPr>
-              <w:t>Test 6</w:t>
+              <w:t xml:space="preserve">Test </w:t>
+            </w:r>
+            <w:r>
+              <w:rPr>
+                <w:rFonts w:ascii="Arial" w:hAnsi="Arial" w:cs="Arial"/>
+                <w:b/>
+                <w:bCs/>
+                <w:sz w:val="20"/>
+                <w:szCs w:val="20"/>
+              </w:rPr>
+              <w:t>6</w:t>
             </w:r>
           </w:p>
         </w:tc>
@@ -9025,7 +8645,7 @@
                 <w:sz w:val="20"/>
                 <w:szCs w:val="20"/>
               </w:rPr>
-              <w:t>User Registration Page 1 time per User</w:t>
+              <w:t>Login Session Test</w:t>
             </w:r>
           </w:p>
         </w:tc>
@@ -9087,7 +8707,7 @@
                 <w:sz w:val="20"/>
                 <w:szCs w:val="20"/>
               </w:rPr>
-              <w:t>Test Objective: User should only be able to register 1 time with each email(username).</w:t>
+              <w:t>Test Objective: When the User Logs In they should stay logged in for a period of time in which they should not be allowed to login or sign up unless signed out.</w:t>
             </w:r>
           </w:p>
         </w:tc>
@@ -9143,29 +8763,7 @@
                 <w:sz w:val="20"/>
                 <w:szCs w:val="20"/>
               </w:rPr>
-              <w:t>Date tested: &lt;</w:t>
-            </w:r>
-            <w:proofErr w:type="spellStart"/>
-            <w:r>
-              <w:rPr>
-                <w:rFonts w:ascii="Arial" w:hAnsi="Arial" w:cs="Arial"/>
-                <w:b/>
-                <w:bCs/>
-                <w:sz w:val="20"/>
-                <w:szCs w:val="20"/>
-              </w:rPr>
-              <w:t>yyyy</w:t>
-            </w:r>
-            <w:proofErr w:type="spellEnd"/>
-            <w:r>
-              <w:rPr>
-                <w:rFonts w:ascii="Arial" w:hAnsi="Arial" w:cs="Arial"/>
-                <w:b/>
-                <w:bCs/>
-                <w:sz w:val="20"/>
-                <w:szCs w:val="20"/>
-              </w:rPr>
-              <w:t xml:space="preserve">/mm/dd&gt; </w:t>
+              <w:t xml:space="preserve">Date tested: &lt;yyyy/mm/dd&gt; </w:t>
             </w:r>
           </w:p>
         </w:tc>
@@ -9222,29 +8820,7 @@
                 <w:sz w:val="20"/>
                 <w:szCs w:val="20"/>
               </w:rPr>
-              <w:t>Date tested: &lt;</w:t>
-            </w:r>
-            <w:proofErr w:type="spellStart"/>
-            <w:r>
-              <w:rPr>
-                <w:rFonts w:ascii="Arial" w:hAnsi="Arial" w:cs="Arial"/>
-                <w:b/>
-                <w:bCs/>
-                <w:sz w:val="20"/>
-                <w:szCs w:val="20"/>
-              </w:rPr>
-              <w:t>yyyy</w:t>
-            </w:r>
-            <w:proofErr w:type="spellEnd"/>
-            <w:r>
-              <w:rPr>
-                <w:rFonts w:ascii="Arial" w:hAnsi="Arial" w:cs="Arial"/>
-                <w:b/>
-                <w:bCs/>
-                <w:sz w:val="20"/>
-                <w:szCs w:val="20"/>
-              </w:rPr>
-              <w:t>/mm/dd&gt;</w:t>
+              <w:t>Date tested: &lt;yyyy/mm/dd&gt;</w:t>
             </w:r>
           </w:p>
         </w:tc>
@@ -9492,7 +9068,7 @@
                 <w:sz w:val="20"/>
                 <w:szCs w:val="20"/>
               </w:rPr>
-              <w:t>User enters duplicate email</w:t>
+              <w:t>User Logs In</w:t>
             </w:r>
           </w:p>
         </w:tc>
@@ -9526,7 +9102,7 @@
                 <w:sz w:val="20"/>
                 <w:szCs w:val="20"/>
               </w:rPr>
-              <w:t>Email is displayed correctly in the email field</w:t>
+              <w:t>User Logs in Successfully</w:t>
             </w:r>
           </w:p>
         </w:tc>
@@ -9667,7 +9243,7 @@
                 <w:sz w:val="20"/>
                 <w:szCs w:val="20"/>
               </w:rPr>
-              <w:t xml:space="preserve">User enters the rest of the required information </w:t>
+              <w:t>User returns to Landing Page</w:t>
             </w:r>
           </w:p>
         </w:tc>
@@ -9701,31 +9277,7 @@
                 <w:sz w:val="20"/>
                 <w:szCs w:val="20"/>
               </w:rPr>
-              <w:t xml:space="preserve">The information is displayed correctly in </w:t>
-            </w:r>
-            <w:proofErr w:type="spellStart"/>
-            <w:proofErr w:type="gramStart"/>
-            <w:r>
-              <w:rPr>
-                <w:rFonts w:ascii="Arial" w:hAnsi="Arial" w:cs="Arial"/>
-                <w:b/>
-                <w:bCs/>
-                <w:sz w:val="20"/>
-                <w:szCs w:val="20"/>
-              </w:rPr>
-              <w:t>there</w:t>
-            </w:r>
-            <w:proofErr w:type="spellEnd"/>
-            <w:proofErr w:type="gramEnd"/>
-            <w:r>
-              <w:rPr>
-                <w:rFonts w:ascii="Arial" w:hAnsi="Arial" w:cs="Arial"/>
-                <w:b/>
-                <w:bCs/>
-                <w:sz w:val="20"/>
-                <w:szCs w:val="20"/>
-              </w:rPr>
-              <w:t xml:space="preserve"> respective fields</w:t>
+              <w:t>User returns to Landing Page with them still being logged in from the indication in the top right corner</w:t>
             </w:r>
           </w:p>
         </w:tc>
@@ -9866,7 +9418,7 @@
                 <w:sz w:val="20"/>
                 <w:szCs w:val="20"/>
               </w:rPr>
-              <w:t>User submits form</w:t>
+              <w:t>User goes to reservations</w:t>
             </w:r>
           </w:p>
         </w:tc>
@@ -9900,29 +9452,7 @@
                 <w:sz w:val="20"/>
                 <w:szCs w:val="20"/>
               </w:rPr>
-              <w:t xml:space="preserve">User is alerted by the website that the email has already been registered and </w:t>
-            </w:r>
-            <w:proofErr w:type="spellStart"/>
-            <w:r>
-              <w:rPr>
-                <w:rFonts w:ascii="Arial" w:hAnsi="Arial" w:cs="Arial"/>
-                <w:b/>
-                <w:bCs/>
-                <w:sz w:val="20"/>
-                <w:szCs w:val="20"/>
-              </w:rPr>
-              <w:t>can not</w:t>
-            </w:r>
-            <w:proofErr w:type="spellEnd"/>
-            <w:r>
-              <w:rPr>
-                <w:rFonts w:ascii="Arial" w:hAnsi="Arial" w:cs="Arial"/>
-                <w:b/>
-                <w:bCs/>
-                <w:sz w:val="20"/>
-                <w:szCs w:val="20"/>
-              </w:rPr>
-              <w:t xml:space="preserve"> be registered again </w:t>
+              <w:t>User is allowed into the reservation page without being prompted to login</w:t>
             </w:r>
           </w:p>
         </w:tc>
@@ -10063,29 +9593,7 @@
                 <w:sz w:val="20"/>
                 <w:szCs w:val="20"/>
               </w:rPr>
-              <w:t xml:space="preserve">Users </w:t>
-            </w:r>
-            <w:proofErr w:type="gramStart"/>
-            <w:r>
-              <w:rPr>
-                <w:rFonts w:ascii="Arial" w:hAnsi="Arial" w:cs="Arial"/>
-                <w:b/>
-                <w:bCs/>
-                <w:sz w:val="20"/>
-                <w:szCs w:val="20"/>
-              </w:rPr>
-              <w:t>enters</w:t>
-            </w:r>
-            <w:proofErr w:type="gramEnd"/>
-            <w:r>
-              <w:rPr>
-                <w:rFonts w:ascii="Arial" w:hAnsi="Arial" w:cs="Arial"/>
-                <w:b/>
-                <w:bCs/>
-                <w:sz w:val="20"/>
-                <w:szCs w:val="20"/>
-              </w:rPr>
-              <w:t xml:space="preserve"> new email</w:t>
+              <w:t>User returns to Landing Page</w:t>
             </w:r>
           </w:p>
         </w:tc>
@@ -10119,7 +9627,7 @@
                 <w:sz w:val="20"/>
                 <w:szCs w:val="20"/>
               </w:rPr>
-              <w:t>Email is displayed correctly in the email field</w:t>
+              <w:t>User returns to Landing page still logged in</w:t>
             </w:r>
           </w:p>
         </w:tc>
@@ -10226,6 +9734,7 @@
                 <w:sz w:val="20"/>
                 <w:szCs w:val="20"/>
               </w:rPr>
+              <w:lastRenderedPageBreak/>
               <w:t>5</w:t>
             </w:r>
           </w:p>
@@ -10260,7 +9769,7 @@
                 <w:sz w:val="20"/>
                 <w:szCs w:val="20"/>
               </w:rPr>
-              <w:t>User resubmits form</w:t>
+              <w:t>User goes to account information</w:t>
             </w:r>
           </w:p>
         </w:tc>
@@ -10286,1526 +9795,15 @@
                 <w:szCs w:val="20"/>
               </w:rPr>
             </w:pPr>
-            <w:proofErr w:type="gramStart"/>
-            <w:r>
-              <w:rPr>
-                <w:rFonts w:ascii="Arial" w:hAnsi="Arial" w:cs="Arial"/>
-                <w:b/>
-                <w:bCs/>
-                <w:sz w:val="20"/>
-                <w:szCs w:val="20"/>
-              </w:rPr>
-              <w:t>User is</w:t>
-            </w:r>
-            <w:proofErr w:type="gramEnd"/>
-            <w:r>
-              <w:rPr>
-                <w:rFonts w:ascii="Arial" w:hAnsi="Arial" w:cs="Arial"/>
-                <w:b/>
-                <w:bCs/>
-                <w:sz w:val="20"/>
-                <w:szCs w:val="20"/>
-              </w:rPr>
-              <w:t xml:space="preserve"> allowed to register new email</w:t>
-            </w:r>
-          </w:p>
-        </w:tc>
-        <w:tc>
-          <w:tcPr>
-            <w:tcW w:w="2148" w:type="dxa"/>
-            <w:tcBorders>
-              <w:top w:val="single" w:sz="4" w:space="0" w:color="auto"/>
-              <w:left w:val="single" w:sz="4" w:space="0" w:color="auto"/>
-              <w:bottom w:val="single" w:sz="4" w:space="0" w:color="auto"/>
-              <w:right w:val="single" w:sz="4" w:space="0" w:color="auto"/>
-            </w:tcBorders>
-            <w:hideMark/>
-          </w:tcPr>
-          <w:p>
-            <w:pPr>
-              <w:spacing w:after="160" w:line="259" w:lineRule="auto"/>
-              <w:rPr>
-                <w:rFonts w:ascii="Arial" w:hAnsi="Arial" w:cs="Arial"/>
-                <w:b/>
-                <w:bCs/>
-                <w:sz w:val="20"/>
-                <w:szCs w:val="20"/>
-              </w:rPr>
-            </w:pPr>
-            <w:r>
-              <w:rPr>
-                <w:rFonts w:ascii="Arial" w:hAnsi="Arial" w:cs="Arial"/>
-                <w:b/>
-                <w:bCs/>
-                <w:sz w:val="20"/>
-                <w:szCs w:val="20"/>
-              </w:rPr>
-              <w:t>&lt;yes/no&gt;</w:t>
-            </w:r>
-          </w:p>
-        </w:tc>
-        <w:tc>
-          <w:tcPr>
-            <w:tcW w:w="2052" w:type="dxa"/>
-            <w:tcBorders>
-              <w:top w:val="single" w:sz="4" w:space="0" w:color="auto"/>
-              <w:left w:val="single" w:sz="4" w:space="0" w:color="auto"/>
-              <w:bottom w:val="single" w:sz="4" w:space="0" w:color="auto"/>
-              <w:right w:val="single" w:sz="4" w:space="0" w:color="auto"/>
-            </w:tcBorders>
-            <w:hideMark/>
-          </w:tcPr>
-          <w:p>
-            <w:pPr>
-              <w:spacing w:after="160" w:line="259" w:lineRule="auto"/>
-              <w:rPr>
-                <w:rFonts w:ascii="Arial" w:hAnsi="Arial" w:cs="Arial"/>
-                <w:b/>
-                <w:bCs/>
-                <w:sz w:val="20"/>
-                <w:szCs w:val="20"/>
-              </w:rPr>
-            </w:pPr>
-            <w:r>
-              <w:rPr>
-                <w:rFonts w:ascii="Arial" w:hAnsi="Arial" w:cs="Arial"/>
-                <w:b/>
-                <w:bCs/>
-                <w:sz w:val="20"/>
-                <w:szCs w:val="20"/>
-              </w:rPr>
-              <w:t>&lt;yes/no&gt;</w:t>
-            </w:r>
-          </w:p>
-        </w:tc>
-      </w:tr>
-      <w:tr>
-        <w:trPr>
-          <w:trHeight w:val="350"/>
-        </w:trPr>
-        <w:tc>
-          <w:tcPr>
-            <w:tcW w:w="1250" w:type="dxa"/>
-            <w:tcBorders>
-              <w:top w:val="single" w:sz="4" w:space="0" w:color="auto"/>
-              <w:left w:val="single" w:sz="4" w:space="0" w:color="auto"/>
-              <w:bottom w:val="single" w:sz="4" w:space="0" w:color="auto"/>
-              <w:right w:val="single" w:sz="4" w:space="0" w:color="auto"/>
-            </w:tcBorders>
-            <w:hideMark/>
-          </w:tcPr>
-          <w:p>
-            <w:pPr>
-              <w:spacing w:after="160" w:line="259" w:lineRule="auto"/>
-              <w:rPr>
-                <w:rFonts w:ascii="Arial" w:hAnsi="Arial" w:cs="Arial"/>
-                <w:b/>
-                <w:bCs/>
-                <w:sz w:val="20"/>
-                <w:szCs w:val="20"/>
-              </w:rPr>
-            </w:pPr>
-            <w:r>
-              <w:rPr>
-                <w:rFonts w:ascii="Arial" w:hAnsi="Arial" w:cs="Arial"/>
-                <w:b/>
-                <w:bCs/>
-                <w:sz w:val="20"/>
-                <w:szCs w:val="20"/>
-              </w:rPr>
-              <w:t>Comments</w:t>
-            </w:r>
-          </w:p>
-        </w:tc>
-        <w:tc>
-          <w:tcPr>
-            <w:tcW w:w="11700" w:type="dxa"/>
-            <w:gridSpan w:val="4"/>
-            <w:tcBorders>
-              <w:top w:val="single" w:sz="4" w:space="0" w:color="auto"/>
-              <w:left w:val="single" w:sz="4" w:space="0" w:color="auto"/>
-              <w:bottom w:val="single" w:sz="4" w:space="0" w:color="auto"/>
-              <w:right w:val="single" w:sz="4" w:space="0" w:color="auto"/>
-            </w:tcBorders>
-            <w:hideMark/>
-          </w:tcPr>
-          <w:p>
-            <w:pPr>
-              <w:spacing w:after="160" w:line="259" w:lineRule="auto"/>
-              <w:rPr>
-                <w:rFonts w:ascii="Arial" w:hAnsi="Arial" w:cs="Arial"/>
-                <w:b/>
-                <w:bCs/>
-                <w:sz w:val="20"/>
-                <w:szCs w:val="20"/>
-              </w:rPr>
-            </w:pPr>
-            <w:r>
-              <w:rPr>
-                <w:rFonts w:ascii="Arial" w:hAnsi="Arial" w:cs="Arial"/>
-                <w:b/>
-                <w:bCs/>
-                <w:sz w:val="20"/>
-                <w:szCs w:val="20"/>
-              </w:rPr>
-              <w:t>Comments should be substantive; this means there should be at least 2-3 well-structured sentences with constructive feedback.</w:t>
-            </w:r>
-          </w:p>
-        </w:tc>
-      </w:tr>
-    </w:tbl>
-    <w:p>
-      <w:pPr>
-        <w:rPr>
-          <w:rFonts w:ascii="Arial" w:hAnsi="Arial" w:cs="Arial"/>
-          <w:b/>
-          <w:bCs/>
-          <w:sz w:val="20"/>
-          <w:szCs w:val="20"/>
-        </w:rPr>
-      </w:pPr>
-    </w:p>
-    <w:tbl>
-      <w:tblPr>
-        <w:tblStyle w:val="TableGrid"/>
-        <w:tblW w:w="0" w:type="auto"/>
-        <w:tblLook w:val="04A0" w:firstRow="1" w:lastRow="0" w:firstColumn="1" w:lastColumn="0" w:noHBand="0" w:noVBand="1"/>
-      </w:tblPr>
-      <w:tblGrid>
-        <w:gridCol w:w="1250"/>
-        <w:gridCol w:w="3570"/>
-        <w:gridCol w:w="3930"/>
-        <w:gridCol w:w="2148"/>
-        <w:gridCol w:w="2052"/>
-      </w:tblGrid>
-      <w:tr>
-        <w:trPr>
-          <w:trHeight w:val="710"/>
-        </w:trPr>
-        <w:tc>
-          <w:tcPr>
-            <w:tcW w:w="1250" w:type="dxa"/>
-            <w:tcBorders>
-              <w:top w:val="single" w:sz="4" w:space="0" w:color="auto"/>
-              <w:left w:val="single" w:sz="4" w:space="0" w:color="auto"/>
-              <w:bottom w:val="single" w:sz="4" w:space="0" w:color="auto"/>
-              <w:right w:val="single" w:sz="4" w:space="0" w:color="auto"/>
-            </w:tcBorders>
-            <w:hideMark/>
-          </w:tcPr>
-          <w:p>
-            <w:pPr>
-              <w:spacing w:after="160" w:line="259" w:lineRule="auto"/>
-              <w:rPr>
-                <w:rFonts w:ascii="Arial" w:hAnsi="Arial" w:cs="Arial"/>
-                <w:b/>
-                <w:bCs/>
-                <w:sz w:val="20"/>
-                <w:szCs w:val="20"/>
-              </w:rPr>
-            </w:pPr>
-            <w:r>
-              <w:rPr>
-                <w:rFonts w:ascii="Arial" w:hAnsi="Arial" w:cs="Arial"/>
-                <w:b/>
-                <w:bCs/>
-                <w:sz w:val="20"/>
-                <w:szCs w:val="20"/>
-              </w:rPr>
-              <w:lastRenderedPageBreak/>
-              <w:t>Test 7</w:t>
-            </w:r>
-          </w:p>
-        </w:tc>
-        <w:tc>
-          <w:tcPr>
-            <w:tcW w:w="11700" w:type="dxa"/>
-            <w:gridSpan w:val="4"/>
-            <w:tcBorders>
-              <w:top w:val="single" w:sz="4" w:space="0" w:color="auto"/>
-              <w:left w:val="single" w:sz="4" w:space="0" w:color="auto"/>
-              <w:bottom w:val="single" w:sz="4" w:space="0" w:color="auto"/>
-              <w:right w:val="single" w:sz="4" w:space="0" w:color="auto"/>
-            </w:tcBorders>
-            <w:hideMark/>
-          </w:tcPr>
-          <w:p>
-            <w:pPr>
-              <w:spacing w:after="160" w:line="259" w:lineRule="auto"/>
-              <w:rPr>
-                <w:rFonts w:ascii="Arial" w:hAnsi="Arial" w:cs="Arial"/>
-                <w:b/>
-                <w:bCs/>
-                <w:sz w:val="20"/>
-                <w:szCs w:val="20"/>
-              </w:rPr>
-            </w:pPr>
-            <w:r>
-              <w:rPr>
-                <w:rFonts w:ascii="Arial" w:hAnsi="Arial" w:cs="Arial"/>
-                <w:b/>
-                <w:bCs/>
-                <w:sz w:val="20"/>
-                <w:szCs w:val="20"/>
-              </w:rPr>
-              <w:t>Login Session Test</w:t>
-            </w:r>
-          </w:p>
-        </w:tc>
-      </w:tr>
-      <w:tr>
-        <w:trPr>
-          <w:trHeight w:val="620"/>
-        </w:trPr>
-        <w:tc>
-          <w:tcPr>
-            <w:tcW w:w="1250" w:type="dxa"/>
-            <w:tcBorders>
-              <w:top w:val="single" w:sz="4" w:space="0" w:color="auto"/>
-              <w:left w:val="single" w:sz="4" w:space="0" w:color="auto"/>
-              <w:bottom w:val="single" w:sz="4" w:space="0" w:color="auto"/>
-              <w:right w:val="single" w:sz="4" w:space="0" w:color="auto"/>
-            </w:tcBorders>
-          </w:tcPr>
-          <w:p>
-            <w:pPr>
-              <w:spacing w:after="160" w:line="259" w:lineRule="auto"/>
-              <w:rPr>
-                <w:rFonts w:ascii="Arial" w:hAnsi="Arial" w:cs="Arial"/>
-                <w:b/>
-                <w:bCs/>
-                <w:sz w:val="20"/>
-                <w:szCs w:val="20"/>
-              </w:rPr>
-            </w:pPr>
-          </w:p>
-        </w:tc>
-        <w:tc>
-          <w:tcPr>
-            <w:tcW w:w="3570" w:type="dxa"/>
-            <w:tcBorders>
-              <w:top w:val="single" w:sz="4" w:space="0" w:color="auto"/>
-              <w:left w:val="single" w:sz="4" w:space="0" w:color="auto"/>
-              <w:bottom w:val="single" w:sz="4" w:space="0" w:color="auto"/>
-              <w:right w:val="single" w:sz="4" w:space="0" w:color="auto"/>
-            </w:tcBorders>
-            <w:hideMark/>
-          </w:tcPr>
-          <w:p>
-            <w:pPr>
-              <w:spacing w:after="160" w:line="259" w:lineRule="auto"/>
-              <w:rPr>
-                <w:rFonts w:ascii="Arial" w:hAnsi="Arial" w:cs="Arial"/>
-                <w:b/>
-                <w:bCs/>
-                <w:sz w:val="20"/>
-                <w:szCs w:val="20"/>
-              </w:rPr>
-            </w:pPr>
-            <w:r>
-              <w:rPr>
-                <w:rFonts w:ascii="Arial" w:hAnsi="Arial" w:cs="Arial"/>
-                <w:b/>
-                <w:bCs/>
-                <w:sz w:val="20"/>
-                <w:szCs w:val="20"/>
-              </w:rPr>
-              <w:t xml:space="preserve">Test Objective: When the User Logs In they should stay logged in for </w:t>
-            </w:r>
-            <w:proofErr w:type="gramStart"/>
-            <w:r>
-              <w:rPr>
-                <w:rFonts w:ascii="Arial" w:hAnsi="Arial" w:cs="Arial"/>
-                <w:b/>
-                <w:bCs/>
-                <w:sz w:val="20"/>
-                <w:szCs w:val="20"/>
-              </w:rPr>
-              <w:t>a period of time</w:t>
-            </w:r>
-            <w:proofErr w:type="gramEnd"/>
-            <w:r>
-              <w:rPr>
-                <w:rFonts w:ascii="Arial" w:hAnsi="Arial" w:cs="Arial"/>
-                <w:b/>
-                <w:bCs/>
-                <w:sz w:val="20"/>
-                <w:szCs w:val="20"/>
-              </w:rPr>
-              <w:t xml:space="preserve"> in which they should not be allowed to login or sign up unless signed out.</w:t>
-            </w:r>
-          </w:p>
-        </w:tc>
-        <w:tc>
-          <w:tcPr>
-            <w:tcW w:w="3930" w:type="dxa"/>
-            <w:tcBorders>
-              <w:top w:val="single" w:sz="4" w:space="0" w:color="auto"/>
-              <w:left w:val="single" w:sz="4" w:space="0" w:color="auto"/>
-              <w:bottom w:val="single" w:sz="4" w:space="0" w:color="auto"/>
-              <w:right w:val="single" w:sz="4" w:space="0" w:color="auto"/>
-            </w:tcBorders>
-            <w:hideMark/>
-          </w:tcPr>
-          <w:p>
-            <w:pPr>
-              <w:spacing w:after="160" w:line="259" w:lineRule="auto"/>
-              <w:rPr>
-                <w:rFonts w:ascii="Arial" w:hAnsi="Arial" w:cs="Arial"/>
-                <w:b/>
-                <w:bCs/>
-                <w:sz w:val="20"/>
-                <w:szCs w:val="20"/>
-              </w:rPr>
-            </w:pPr>
-            <w:r>
-              <w:rPr>
-                <w:rFonts w:ascii="Arial" w:hAnsi="Arial" w:cs="Arial"/>
-                <w:b/>
-                <w:bCs/>
-                <w:sz w:val="20"/>
-                <w:szCs w:val="20"/>
-              </w:rPr>
-              <w:t>Developer:</w:t>
-            </w:r>
-          </w:p>
-          <w:p>
-            <w:pPr>
-              <w:spacing w:after="160" w:line="259" w:lineRule="auto"/>
-              <w:rPr>
-                <w:rFonts w:ascii="Arial" w:hAnsi="Arial" w:cs="Arial"/>
-                <w:b/>
-                <w:bCs/>
-                <w:sz w:val="20"/>
-                <w:szCs w:val="20"/>
-              </w:rPr>
-            </w:pPr>
-            <w:r>
-              <w:rPr>
-                <w:rFonts w:ascii="Arial" w:hAnsi="Arial" w:cs="Arial"/>
-                <w:b/>
-                <w:bCs/>
-                <w:sz w:val="20"/>
-                <w:szCs w:val="20"/>
-              </w:rPr>
-              <w:t>Date tested: &lt;</w:t>
-            </w:r>
-            <w:proofErr w:type="spellStart"/>
-            <w:r>
-              <w:rPr>
-                <w:rFonts w:ascii="Arial" w:hAnsi="Arial" w:cs="Arial"/>
-                <w:b/>
-                <w:bCs/>
-                <w:sz w:val="20"/>
-                <w:szCs w:val="20"/>
-              </w:rPr>
-              <w:t>yyyy</w:t>
-            </w:r>
-            <w:proofErr w:type="spellEnd"/>
-            <w:r>
-              <w:rPr>
-                <w:rFonts w:ascii="Arial" w:hAnsi="Arial" w:cs="Arial"/>
-                <w:b/>
-                <w:bCs/>
-                <w:sz w:val="20"/>
-                <w:szCs w:val="20"/>
-              </w:rPr>
-              <w:t xml:space="preserve">/mm/dd&gt; </w:t>
-            </w:r>
-          </w:p>
-        </w:tc>
-        <w:tc>
-          <w:tcPr>
-            <w:tcW w:w="4200" w:type="dxa"/>
-            <w:gridSpan w:val="2"/>
-            <w:tcBorders>
-              <w:top w:val="single" w:sz="4" w:space="0" w:color="auto"/>
-              <w:left w:val="single" w:sz="4" w:space="0" w:color="auto"/>
-              <w:bottom w:val="single" w:sz="4" w:space="0" w:color="auto"/>
-              <w:right w:val="single" w:sz="4" w:space="0" w:color="auto"/>
-            </w:tcBorders>
-            <w:hideMark/>
-          </w:tcPr>
-          <w:p>
-            <w:pPr>
-              <w:spacing w:after="160" w:line="259" w:lineRule="auto"/>
-              <w:rPr>
-                <w:rFonts w:ascii="Arial" w:hAnsi="Arial" w:cs="Arial"/>
-                <w:b/>
-                <w:bCs/>
-                <w:sz w:val="20"/>
-                <w:szCs w:val="20"/>
-              </w:rPr>
-            </w:pPr>
-            <w:r>
-              <w:rPr>
-                <w:rFonts w:ascii="Arial" w:hAnsi="Arial" w:cs="Arial"/>
-                <w:b/>
-                <w:bCs/>
-                <w:sz w:val="20"/>
-                <w:szCs w:val="20"/>
-              </w:rPr>
-              <w:t xml:space="preserve">Peer tester: </w:t>
-            </w:r>
-          </w:p>
-          <w:p>
-            <w:pPr>
-              <w:spacing w:after="160" w:line="259" w:lineRule="auto"/>
-              <w:rPr>
-                <w:rFonts w:ascii="Arial" w:hAnsi="Arial" w:cs="Arial"/>
-                <w:b/>
-                <w:bCs/>
-                <w:sz w:val="20"/>
-                <w:szCs w:val="20"/>
-              </w:rPr>
-            </w:pPr>
-            <w:r>
-              <w:rPr>
-                <w:rFonts w:ascii="Arial" w:hAnsi="Arial" w:cs="Arial"/>
-                <w:b/>
-                <w:bCs/>
-                <w:sz w:val="20"/>
-                <w:szCs w:val="20"/>
-              </w:rPr>
-              <w:t>Date tested: &lt;</w:t>
-            </w:r>
-            <w:proofErr w:type="spellStart"/>
-            <w:r>
-              <w:rPr>
-                <w:rFonts w:ascii="Arial" w:hAnsi="Arial" w:cs="Arial"/>
-                <w:b/>
-                <w:bCs/>
-                <w:sz w:val="20"/>
-                <w:szCs w:val="20"/>
-              </w:rPr>
-              <w:t>yyyy</w:t>
-            </w:r>
-            <w:proofErr w:type="spellEnd"/>
-            <w:r>
-              <w:rPr>
-                <w:rFonts w:ascii="Arial" w:hAnsi="Arial" w:cs="Arial"/>
-                <w:b/>
-                <w:bCs/>
-                <w:sz w:val="20"/>
-                <w:szCs w:val="20"/>
-              </w:rPr>
-              <w:t>/mm/dd&gt;</w:t>
-            </w:r>
-          </w:p>
-        </w:tc>
-      </w:tr>
-      <w:tr>
-        <w:trPr>
-          <w:trHeight w:val="350"/>
-        </w:trPr>
-        <w:tc>
-          <w:tcPr>
-            <w:tcW w:w="1250" w:type="dxa"/>
-            <w:tcBorders>
-              <w:top w:val="single" w:sz="4" w:space="0" w:color="auto"/>
-              <w:left w:val="single" w:sz="4" w:space="0" w:color="auto"/>
-              <w:bottom w:val="single" w:sz="4" w:space="0" w:color="auto"/>
-              <w:right w:val="single" w:sz="4" w:space="0" w:color="auto"/>
-            </w:tcBorders>
-            <w:hideMark/>
-          </w:tcPr>
-          <w:p>
-            <w:pPr>
-              <w:spacing w:after="160" w:line="259" w:lineRule="auto"/>
-              <w:rPr>
-                <w:rFonts w:ascii="Arial" w:hAnsi="Arial" w:cs="Arial"/>
-                <w:b/>
-                <w:bCs/>
-                <w:sz w:val="20"/>
-                <w:szCs w:val="20"/>
-              </w:rPr>
-            </w:pPr>
-            <w:r>
-              <w:rPr>
-                <w:rFonts w:ascii="Arial" w:hAnsi="Arial" w:cs="Arial"/>
-                <w:b/>
-                <w:bCs/>
-                <w:sz w:val="20"/>
-                <w:szCs w:val="20"/>
-              </w:rPr>
-              <w:t>Step</w:t>
-            </w:r>
-          </w:p>
-        </w:tc>
-        <w:tc>
-          <w:tcPr>
-            <w:tcW w:w="3570" w:type="dxa"/>
-            <w:tcBorders>
-              <w:top w:val="single" w:sz="4" w:space="0" w:color="auto"/>
-              <w:left w:val="single" w:sz="4" w:space="0" w:color="auto"/>
-              <w:bottom w:val="single" w:sz="4" w:space="0" w:color="auto"/>
-              <w:right w:val="single" w:sz="4" w:space="0" w:color="auto"/>
-            </w:tcBorders>
-            <w:hideMark/>
-          </w:tcPr>
-          <w:p>
-            <w:pPr>
-              <w:spacing w:after="160" w:line="259" w:lineRule="auto"/>
-              <w:rPr>
-                <w:rFonts w:ascii="Arial" w:hAnsi="Arial" w:cs="Arial"/>
-                <w:b/>
-                <w:bCs/>
-                <w:sz w:val="20"/>
-                <w:szCs w:val="20"/>
-              </w:rPr>
-            </w:pPr>
-            <w:r>
-              <w:rPr>
-                <w:rFonts w:ascii="Arial" w:hAnsi="Arial" w:cs="Arial"/>
-                <w:b/>
-                <w:bCs/>
-                <w:sz w:val="20"/>
-                <w:szCs w:val="20"/>
-              </w:rPr>
-              <w:t>Action</w:t>
-            </w:r>
-          </w:p>
-        </w:tc>
-        <w:tc>
-          <w:tcPr>
-            <w:tcW w:w="3930" w:type="dxa"/>
-            <w:tcBorders>
-              <w:top w:val="single" w:sz="4" w:space="0" w:color="auto"/>
-              <w:left w:val="single" w:sz="4" w:space="0" w:color="auto"/>
-              <w:bottom w:val="single" w:sz="4" w:space="0" w:color="auto"/>
-              <w:right w:val="single" w:sz="4" w:space="0" w:color="auto"/>
-            </w:tcBorders>
-            <w:hideMark/>
-          </w:tcPr>
-          <w:p>
-            <w:pPr>
-              <w:spacing w:after="160" w:line="259" w:lineRule="auto"/>
-              <w:rPr>
-                <w:rFonts w:ascii="Arial" w:hAnsi="Arial" w:cs="Arial"/>
-                <w:b/>
-                <w:bCs/>
-                <w:sz w:val="20"/>
-                <w:szCs w:val="20"/>
-              </w:rPr>
-            </w:pPr>
-            <w:r>
-              <w:rPr>
-                <w:rFonts w:ascii="Arial" w:hAnsi="Arial" w:cs="Arial"/>
-                <w:b/>
-                <w:bCs/>
-                <w:sz w:val="20"/>
-                <w:szCs w:val="20"/>
-              </w:rPr>
-              <w:t>Expected results:</w:t>
-            </w:r>
-          </w:p>
-        </w:tc>
-        <w:tc>
-          <w:tcPr>
-            <w:tcW w:w="2148" w:type="dxa"/>
-            <w:tcBorders>
-              <w:top w:val="single" w:sz="4" w:space="0" w:color="auto"/>
-              <w:left w:val="single" w:sz="4" w:space="0" w:color="auto"/>
-              <w:bottom w:val="single" w:sz="4" w:space="0" w:color="auto"/>
-              <w:right w:val="single" w:sz="4" w:space="0" w:color="auto"/>
-            </w:tcBorders>
-            <w:hideMark/>
-          </w:tcPr>
-          <w:p>
-            <w:pPr>
-              <w:spacing w:after="160" w:line="259" w:lineRule="auto"/>
-              <w:rPr>
-                <w:rFonts w:ascii="Arial" w:hAnsi="Arial" w:cs="Arial"/>
-                <w:b/>
-                <w:bCs/>
-                <w:sz w:val="20"/>
-                <w:szCs w:val="20"/>
-              </w:rPr>
-            </w:pPr>
-            <w:r>
-              <w:rPr>
-                <w:rFonts w:ascii="Arial" w:hAnsi="Arial" w:cs="Arial"/>
-                <w:b/>
-                <w:bCs/>
-                <w:sz w:val="20"/>
-                <w:szCs w:val="20"/>
-              </w:rPr>
-              <w:t>Developer pass/fail</w:t>
-            </w:r>
-          </w:p>
-        </w:tc>
-        <w:tc>
-          <w:tcPr>
-            <w:tcW w:w="2052" w:type="dxa"/>
-            <w:tcBorders>
-              <w:top w:val="single" w:sz="4" w:space="0" w:color="auto"/>
-              <w:left w:val="single" w:sz="4" w:space="0" w:color="auto"/>
-              <w:bottom w:val="single" w:sz="4" w:space="0" w:color="auto"/>
-              <w:right w:val="single" w:sz="4" w:space="0" w:color="auto"/>
-            </w:tcBorders>
-            <w:hideMark/>
-          </w:tcPr>
-          <w:p>
-            <w:pPr>
-              <w:spacing w:after="160" w:line="259" w:lineRule="auto"/>
-              <w:rPr>
-                <w:rFonts w:ascii="Arial" w:hAnsi="Arial" w:cs="Arial"/>
-                <w:b/>
-                <w:bCs/>
-                <w:sz w:val="20"/>
-                <w:szCs w:val="20"/>
-              </w:rPr>
-            </w:pPr>
-            <w:r>
-              <w:rPr>
-                <w:rFonts w:ascii="Arial" w:hAnsi="Arial" w:cs="Arial"/>
-                <w:b/>
-                <w:bCs/>
-                <w:sz w:val="20"/>
-                <w:szCs w:val="20"/>
-              </w:rPr>
-              <w:t>Tester pass/fail</w:t>
-            </w:r>
-          </w:p>
-        </w:tc>
-      </w:tr>
-      <w:tr>
-        <w:trPr>
-          <w:trHeight w:val="350"/>
-        </w:trPr>
-        <w:tc>
-          <w:tcPr>
-            <w:tcW w:w="1250" w:type="dxa"/>
-            <w:tcBorders>
-              <w:top w:val="single" w:sz="4" w:space="0" w:color="auto"/>
-              <w:left w:val="single" w:sz="4" w:space="0" w:color="auto"/>
-              <w:bottom w:val="single" w:sz="4" w:space="0" w:color="auto"/>
-              <w:right w:val="single" w:sz="4" w:space="0" w:color="auto"/>
-            </w:tcBorders>
-            <w:hideMark/>
-          </w:tcPr>
-          <w:p>
-            <w:pPr>
-              <w:spacing w:after="160" w:line="259" w:lineRule="auto"/>
-              <w:rPr>
-                <w:rFonts w:ascii="Arial" w:hAnsi="Arial" w:cs="Arial"/>
-                <w:b/>
-                <w:bCs/>
-                <w:sz w:val="20"/>
-                <w:szCs w:val="20"/>
-              </w:rPr>
-            </w:pPr>
-            <w:r>
-              <w:rPr>
-                <w:rFonts w:ascii="Arial" w:hAnsi="Arial" w:cs="Arial"/>
-                <w:b/>
-                <w:bCs/>
-                <w:sz w:val="20"/>
-                <w:szCs w:val="20"/>
-              </w:rPr>
-              <w:t>1</w:t>
-            </w:r>
-          </w:p>
-        </w:tc>
-        <w:tc>
-          <w:tcPr>
-            <w:tcW w:w="3570" w:type="dxa"/>
-            <w:tcBorders>
-              <w:top w:val="single" w:sz="4" w:space="0" w:color="auto"/>
-              <w:left w:val="single" w:sz="4" w:space="0" w:color="auto"/>
-              <w:bottom w:val="single" w:sz="4" w:space="0" w:color="auto"/>
-              <w:right w:val="single" w:sz="4" w:space="0" w:color="auto"/>
-            </w:tcBorders>
-            <w:hideMark/>
-          </w:tcPr>
-          <w:p>
-            <w:pPr>
-              <w:spacing w:after="160" w:line="259" w:lineRule="auto"/>
-              <w:rPr>
-                <w:rFonts w:ascii="Arial" w:hAnsi="Arial" w:cs="Arial"/>
-                <w:b/>
-                <w:bCs/>
-                <w:sz w:val="20"/>
-                <w:szCs w:val="20"/>
-              </w:rPr>
-            </w:pPr>
-            <w:r>
-              <w:rPr>
-                <w:rFonts w:ascii="Arial" w:hAnsi="Arial" w:cs="Arial"/>
-                <w:b/>
-                <w:bCs/>
-                <w:sz w:val="20"/>
-                <w:szCs w:val="20"/>
-              </w:rPr>
-              <w:t>User Logs In</w:t>
-            </w:r>
-          </w:p>
-        </w:tc>
-        <w:tc>
-          <w:tcPr>
-            <w:tcW w:w="3930" w:type="dxa"/>
-            <w:tcBorders>
-              <w:top w:val="single" w:sz="4" w:space="0" w:color="auto"/>
-              <w:left w:val="single" w:sz="4" w:space="0" w:color="auto"/>
-              <w:bottom w:val="single" w:sz="4" w:space="0" w:color="auto"/>
-              <w:right w:val="single" w:sz="4" w:space="0" w:color="auto"/>
-            </w:tcBorders>
-            <w:hideMark/>
-          </w:tcPr>
-          <w:p>
-            <w:pPr>
-              <w:spacing w:after="160" w:line="259" w:lineRule="auto"/>
-              <w:rPr>
-                <w:rFonts w:ascii="Arial" w:hAnsi="Arial" w:cs="Arial"/>
-                <w:b/>
-                <w:bCs/>
-                <w:sz w:val="20"/>
-                <w:szCs w:val="20"/>
-              </w:rPr>
-            </w:pPr>
-            <w:r>
-              <w:rPr>
-                <w:rFonts w:ascii="Arial" w:hAnsi="Arial" w:cs="Arial"/>
-                <w:b/>
-                <w:bCs/>
-                <w:sz w:val="20"/>
-                <w:szCs w:val="20"/>
-              </w:rPr>
-              <w:t>User Logs in Successfully</w:t>
-            </w:r>
-          </w:p>
-        </w:tc>
-        <w:tc>
-          <w:tcPr>
-            <w:tcW w:w="2148" w:type="dxa"/>
-            <w:tcBorders>
-              <w:top w:val="single" w:sz="4" w:space="0" w:color="auto"/>
-              <w:left w:val="single" w:sz="4" w:space="0" w:color="auto"/>
-              <w:bottom w:val="single" w:sz="4" w:space="0" w:color="auto"/>
-              <w:right w:val="single" w:sz="4" w:space="0" w:color="auto"/>
-            </w:tcBorders>
-            <w:hideMark/>
-          </w:tcPr>
-          <w:p>
-            <w:pPr>
-              <w:spacing w:after="160" w:line="259" w:lineRule="auto"/>
-              <w:rPr>
-                <w:rFonts w:ascii="Arial" w:hAnsi="Arial" w:cs="Arial"/>
-                <w:b/>
-                <w:bCs/>
-                <w:sz w:val="20"/>
-                <w:szCs w:val="20"/>
-              </w:rPr>
-            </w:pPr>
-            <w:r>
-              <w:rPr>
-                <w:rFonts w:ascii="Arial" w:hAnsi="Arial" w:cs="Arial"/>
-                <w:b/>
-                <w:bCs/>
-                <w:sz w:val="20"/>
-                <w:szCs w:val="20"/>
-              </w:rPr>
-              <w:t>&lt;yes/no&gt;</w:t>
-            </w:r>
-          </w:p>
-        </w:tc>
-        <w:tc>
-          <w:tcPr>
-            <w:tcW w:w="2052" w:type="dxa"/>
-            <w:tcBorders>
-              <w:top w:val="single" w:sz="4" w:space="0" w:color="auto"/>
-              <w:left w:val="single" w:sz="4" w:space="0" w:color="auto"/>
-              <w:bottom w:val="single" w:sz="4" w:space="0" w:color="auto"/>
-              <w:right w:val="single" w:sz="4" w:space="0" w:color="auto"/>
-            </w:tcBorders>
-            <w:hideMark/>
-          </w:tcPr>
-          <w:p>
-            <w:pPr>
-              <w:spacing w:after="160" w:line="259" w:lineRule="auto"/>
-              <w:rPr>
-                <w:rFonts w:ascii="Arial" w:hAnsi="Arial" w:cs="Arial"/>
-                <w:b/>
-                <w:bCs/>
-                <w:sz w:val="20"/>
-                <w:szCs w:val="20"/>
-              </w:rPr>
-            </w:pPr>
-            <w:r>
-              <w:rPr>
-                <w:rFonts w:ascii="Arial" w:hAnsi="Arial" w:cs="Arial"/>
-                <w:b/>
-                <w:bCs/>
-                <w:sz w:val="20"/>
-                <w:szCs w:val="20"/>
-              </w:rPr>
-              <w:t>&lt;yes/no&gt;</w:t>
-            </w:r>
-          </w:p>
-        </w:tc>
-      </w:tr>
-      <w:tr>
-        <w:trPr>
-          <w:trHeight w:val="350"/>
-        </w:trPr>
-        <w:tc>
-          <w:tcPr>
-            <w:tcW w:w="1250" w:type="dxa"/>
-            <w:tcBorders>
-              <w:top w:val="single" w:sz="4" w:space="0" w:color="auto"/>
-              <w:left w:val="single" w:sz="4" w:space="0" w:color="auto"/>
-              <w:bottom w:val="single" w:sz="4" w:space="0" w:color="auto"/>
-              <w:right w:val="single" w:sz="4" w:space="0" w:color="auto"/>
-            </w:tcBorders>
-            <w:hideMark/>
-          </w:tcPr>
-          <w:p>
-            <w:pPr>
-              <w:spacing w:after="160" w:line="259" w:lineRule="auto"/>
-              <w:rPr>
-                <w:rFonts w:ascii="Arial" w:hAnsi="Arial" w:cs="Arial"/>
-                <w:b/>
-                <w:bCs/>
-                <w:sz w:val="20"/>
-                <w:szCs w:val="20"/>
-              </w:rPr>
-            </w:pPr>
-            <w:r>
-              <w:rPr>
-                <w:rFonts w:ascii="Arial" w:hAnsi="Arial" w:cs="Arial"/>
-                <w:b/>
-                <w:bCs/>
-                <w:sz w:val="20"/>
-                <w:szCs w:val="20"/>
-              </w:rPr>
-              <w:t>2</w:t>
-            </w:r>
-          </w:p>
-        </w:tc>
-        <w:tc>
-          <w:tcPr>
-            <w:tcW w:w="3570" w:type="dxa"/>
-            <w:tcBorders>
-              <w:top w:val="single" w:sz="4" w:space="0" w:color="auto"/>
-              <w:left w:val="single" w:sz="4" w:space="0" w:color="auto"/>
-              <w:bottom w:val="single" w:sz="4" w:space="0" w:color="auto"/>
-              <w:right w:val="single" w:sz="4" w:space="0" w:color="auto"/>
-            </w:tcBorders>
-            <w:hideMark/>
-          </w:tcPr>
-          <w:p>
-            <w:pPr>
-              <w:spacing w:after="160" w:line="259" w:lineRule="auto"/>
-              <w:rPr>
-                <w:rFonts w:ascii="Arial" w:hAnsi="Arial" w:cs="Arial"/>
-                <w:b/>
-                <w:bCs/>
-                <w:sz w:val="20"/>
-                <w:szCs w:val="20"/>
-              </w:rPr>
-            </w:pPr>
-            <w:r>
-              <w:rPr>
-                <w:rFonts w:ascii="Arial" w:hAnsi="Arial" w:cs="Arial"/>
-                <w:b/>
-                <w:bCs/>
-                <w:sz w:val="20"/>
-                <w:szCs w:val="20"/>
-              </w:rPr>
-              <w:t>User returns to Landing Page</w:t>
-            </w:r>
-          </w:p>
-        </w:tc>
-        <w:tc>
-          <w:tcPr>
-            <w:tcW w:w="3930" w:type="dxa"/>
-            <w:tcBorders>
-              <w:top w:val="single" w:sz="4" w:space="0" w:color="auto"/>
-              <w:left w:val="single" w:sz="4" w:space="0" w:color="auto"/>
-              <w:bottom w:val="single" w:sz="4" w:space="0" w:color="auto"/>
-              <w:right w:val="single" w:sz="4" w:space="0" w:color="auto"/>
-            </w:tcBorders>
-            <w:hideMark/>
-          </w:tcPr>
-          <w:p>
-            <w:pPr>
-              <w:spacing w:after="160" w:line="259" w:lineRule="auto"/>
-              <w:rPr>
-                <w:rFonts w:ascii="Arial" w:hAnsi="Arial" w:cs="Arial"/>
-                <w:b/>
-                <w:bCs/>
-                <w:sz w:val="20"/>
-                <w:szCs w:val="20"/>
-              </w:rPr>
-            </w:pPr>
-            <w:r>
-              <w:rPr>
-                <w:rFonts w:ascii="Arial" w:hAnsi="Arial" w:cs="Arial"/>
-                <w:b/>
-                <w:bCs/>
-                <w:sz w:val="20"/>
-                <w:szCs w:val="20"/>
-              </w:rPr>
-              <w:t>User returns to Landing Page with them still being logged in from the indication in the top right corner</w:t>
-            </w:r>
-          </w:p>
-        </w:tc>
-        <w:tc>
-          <w:tcPr>
-            <w:tcW w:w="2148" w:type="dxa"/>
-            <w:tcBorders>
-              <w:top w:val="single" w:sz="4" w:space="0" w:color="auto"/>
-              <w:left w:val="single" w:sz="4" w:space="0" w:color="auto"/>
-              <w:bottom w:val="single" w:sz="4" w:space="0" w:color="auto"/>
-              <w:right w:val="single" w:sz="4" w:space="0" w:color="auto"/>
-            </w:tcBorders>
-            <w:hideMark/>
-          </w:tcPr>
-          <w:p>
-            <w:pPr>
-              <w:spacing w:after="160" w:line="259" w:lineRule="auto"/>
-              <w:rPr>
-                <w:rFonts w:ascii="Arial" w:hAnsi="Arial" w:cs="Arial"/>
-                <w:b/>
-                <w:bCs/>
-                <w:sz w:val="20"/>
-                <w:szCs w:val="20"/>
-              </w:rPr>
-            </w:pPr>
-            <w:r>
-              <w:rPr>
-                <w:rFonts w:ascii="Arial" w:hAnsi="Arial" w:cs="Arial"/>
-                <w:b/>
-                <w:bCs/>
-                <w:sz w:val="20"/>
-                <w:szCs w:val="20"/>
-              </w:rPr>
-              <w:t>&lt;yes/no&gt;</w:t>
-            </w:r>
-          </w:p>
-        </w:tc>
-        <w:tc>
-          <w:tcPr>
-            <w:tcW w:w="2052" w:type="dxa"/>
-            <w:tcBorders>
-              <w:top w:val="single" w:sz="4" w:space="0" w:color="auto"/>
-              <w:left w:val="single" w:sz="4" w:space="0" w:color="auto"/>
-              <w:bottom w:val="single" w:sz="4" w:space="0" w:color="auto"/>
-              <w:right w:val="single" w:sz="4" w:space="0" w:color="auto"/>
-            </w:tcBorders>
-            <w:hideMark/>
-          </w:tcPr>
-          <w:p>
-            <w:pPr>
-              <w:spacing w:after="160" w:line="259" w:lineRule="auto"/>
-              <w:rPr>
-                <w:rFonts w:ascii="Arial" w:hAnsi="Arial" w:cs="Arial"/>
-                <w:b/>
-                <w:bCs/>
-                <w:sz w:val="20"/>
-                <w:szCs w:val="20"/>
-              </w:rPr>
-            </w:pPr>
-            <w:r>
-              <w:rPr>
-                <w:rFonts w:ascii="Arial" w:hAnsi="Arial" w:cs="Arial"/>
-                <w:b/>
-                <w:bCs/>
-                <w:sz w:val="20"/>
-                <w:szCs w:val="20"/>
-              </w:rPr>
-              <w:t>&lt;yes/no&gt;</w:t>
-            </w:r>
-          </w:p>
-        </w:tc>
-      </w:tr>
-      <w:tr>
-        <w:trPr>
-          <w:trHeight w:val="350"/>
-        </w:trPr>
-        <w:tc>
-          <w:tcPr>
-            <w:tcW w:w="1250" w:type="dxa"/>
-            <w:tcBorders>
-              <w:top w:val="single" w:sz="4" w:space="0" w:color="auto"/>
-              <w:left w:val="single" w:sz="4" w:space="0" w:color="auto"/>
-              <w:bottom w:val="single" w:sz="4" w:space="0" w:color="auto"/>
-              <w:right w:val="single" w:sz="4" w:space="0" w:color="auto"/>
-            </w:tcBorders>
-            <w:hideMark/>
-          </w:tcPr>
-          <w:p>
-            <w:pPr>
-              <w:spacing w:after="160" w:line="259" w:lineRule="auto"/>
-              <w:rPr>
-                <w:rFonts w:ascii="Arial" w:hAnsi="Arial" w:cs="Arial"/>
-                <w:b/>
-                <w:bCs/>
-                <w:sz w:val="20"/>
-                <w:szCs w:val="20"/>
-              </w:rPr>
-            </w:pPr>
-            <w:r>
-              <w:rPr>
-                <w:rFonts w:ascii="Arial" w:hAnsi="Arial" w:cs="Arial"/>
-                <w:b/>
-                <w:bCs/>
-                <w:sz w:val="20"/>
-                <w:szCs w:val="20"/>
-              </w:rPr>
-              <w:t>3</w:t>
-            </w:r>
-          </w:p>
-        </w:tc>
-        <w:tc>
-          <w:tcPr>
-            <w:tcW w:w="3570" w:type="dxa"/>
-            <w:tcBorders>
-              <w:top w:val="single" w:sz="4" w:space="0" w:color="auto"/>
-              <w:left w:val="single" w:sz="4" w:space="0" w:color="auto"/>
-              <w:bottom w:val="single" w:sz="4" w:space="0" w:color="auto"/>
-              <w:right w:val="single" w:sz="4" w:space="0" w:color="auto"/>
-            </w:tcBorders>
-            <w:hideMark/>
-          </w:tcPr>
-          <w:p>
-            <w:pPr>
-              <w:spacing w:after="160" w:line="259" w:lineRule="auto"/>
-              <w:rPr>
-                <w:rFonts w:ascii="Arial" w:hAnsi="Arial" w:cs="Arial"/>
-                <w:b/>
-                <w:bCs/>
-                <w:sz w:val="20"/>
-                <w:szCs w:val="20"/>
-              </w:rPr>
-            </w:pPr>
-            <w:r>
-              <w:rPr>
-                <w:rFonts w:ascii="Arial" w:hAnsi="Arial" w:cs="Arial"/>
-                <w:b/>
-                <w:bCs/>
-                <w:sz w:val="20"/>
-                <w:szCs w:val="20"/>
-              </w:rPr>
-              <w:t>User goes to reservations</w:t>
-            </w:r>
-          </w:p>
-        </w:tc>
-        <w:tc>
-          <w:tcPr>
-            <w:tcW w:w="3930" w:type="dxa"/>
-            <w:tcBorders>
-              <w:top w:val="single" w:sz="4" w:space="0" w:color="auto"/>
-              <w:left w:val="single" w:sz="4" w:space="0" w:color="auto"/>
-              <w:bottom w:val="single" w:sz="4" w:space="0" w:color="auto"/>
-              <w:right w:val="single" w:sz="4" w:space="0" w:color="auto"/>
-            </w:tcBorders>
-            <w:hideMark/>
-          </w:tcPr>
-          <w:p>
-            <w:pPr>
-              <w:spacing w:after="160" w:line="259" w:lineRule="auto"/>
-              <w:rPr>
-                <w:rFonts w:ascii="Arial" w:hAnsi="Arial" w:cs="Arial"/>
-                <w:b/>
-                <w:bCs/>
-                <w:sz w:val="20"/>
-                <w:szCs w:val="20"/>
-              </w:rPr>
-            </w:pPr>
-            <w:proofErr w:type="gramStart"/>
-            <w:r>
-              <w:rPr>
-                <w:rFonts w:ascii="Arial" w:hAnsi="Arial" w:cs="Arial"/>
-                <w:b/>
-                <w:bCs/>
-                <w:sz w:val="20"/>
-                <w:szCs w:val="20"/>
-              </w:rPr>
-              <w:t>User is</w:t>
-            </w:r>
-            <w:proofErr w:type="gramEnd"/>
-            <w:r>
-              <w:rPr>
-                <w:rFonts w:ascii="Arial" w:hAnsi="Arial" w:cs="Arial"/>
-                <w:b/>
-                <w:bCs/>
-                <w:sz w:val="20"/>
-                <w:szCs w:val="20"/>
-              </w:rPr>
-              <w:t xml:space="preserve"> allowed into the reservation page without being prompted to login</w:t>
-            </w:r>
-          </w:p>
-        </w:tc>
-        <w:tc>
-          <w:tcPr>
-            <w:tcW w:w="2148" w:type="dxa"/>
-            <w:tcBorders>
-              <w:top w:val="single" w:sz="4" w:space="0" w:color="auto"/>
-              <w:left w:val="single" w:sz="4" w:space="0" w:color="auto"/>
-              <w:bottom w:val="single" w:sz="4" w:space="0" w:color="auto"/>
-              <w:right w:val="single" w:sz="4" w:space="0" w:color="auto"/>
-            </w:tcBorders>
-            <w:hideMark/>
-          </w:tcPr>
-          <w:p>
-            <w:pPr>
-              <w:spacing w:after="160" w:line="259" w:lineRule="auto"/>
-              <w:rPr>
-                <w:rFonts w:ascii="Arial" w:hAnsi="Arial" w:cs="Arial"/>
-                <w:b/>
-                <w:bCs/>
-                <w:sz w:val="20"/>
-                <w:szCs w:val="20"/>
-              </w:rPr>
-            </w:pPr>
-            <w:r>
-              <w:rPr>
-                <w:rFonts w:ascii="Arial" w:hAnsi="Arial" w:cs="Arial"/>
-                <w:b/>
-                <w:bCs/>
-                <w:sz w:val="20"/>
-                <w:szCs w:val="20"/>
-              </w:rPr>
-              <w:t>&lt;yes/no&gt;</w:t>
-            </w:r>
-          </w:p>
-        </w:tc>
-        <w:tc>
-          <w:tcPr>
-            <w:tcW w:w="2052" w:type="dxa"/>
-            <w:tcBorders>
-              <w:top w:val="single" w:sz="4" w:space="0" w:color="auto"/>
-              <w:left w:val="single" w:sz="4" w:space="0" w:color="auto"/>
-              <w:bottom w:val="single" w:sz="4" w:space="0" w:color="auto"/>
-              <w:right w:val="single" w:sz="4" w:space="0" w:color="auto"/>
-            </w:tcBorders>
-            <w:hideMark/>
-          </w:tcPr>
-          <w:p>
-            <w:pPr>
-              <w:spacing w:after="160" w:line="259" w:lineRule="auto"/>
-              <w:rPr>
-                <w:rFonts w:ascii="Arial" w:hAnsi="Arial" w:cs="Arial"/>
-                <w:b/>
-                <w:bCs/>
-                <w:sz w:val="20"/>
-                <w:szCs w:val="20"/>
-              </w:rPr>
-            </w:pPr>
-            <w:r>
-              <w:rPr>
-                <w:rFonts w:ascii="Arial" w:hAnsi="Arial" w:cs="Arial"/>
-                <w:b/>
-                <w:bCs/>
-                <w:sz w:val="20"/>
-                <w:szCs w:val="20"/>
-              </w:rPr>
-              <w:t>&lt;yes/no&gt;</w:t>
-            </w:r>
-          </w:p>
-        </w:tc>
-      </w:tr>
-      <w:tr>
-        <w:trPr>
-          <w:trHeight w:val="350"/>
-        </w:trPr>
-        <w:tc>
-          <w:tcPr>
-            <w:tcW w:w="1250" w:type="dxa"/>
-            <w:tcBorders>
-              <w:top w:val="single" w:sz="4" w:space="0" w:color="auto"/>
-              <w:left w:val="single" w:sz="4" w:space="0" w:color="auto"/>
-              <w:bottom w:val="single" w:sz="4" w:space="0" w:color="auto"/>
-              <w:right w:val="single" w:sz="4" w:space="0" w:color="auto"/>
-            </w:tcBorders>
-            <w:hideMark/>
-          </w:tcPr>
-          <w:p>
-            <w:pPr>
-              <w:spacing w:after="160" w:line="259" w:lineRule="auto"/>
-              <w:rPr>
-                <w:rFonts w:ascii="Arial" w:hAnsi="Arial" w:cs="Arial"/>
-                <w:b/>
-                <w:bCs/>
-                <w:sz w:val="20"/>
-                <w:szCs w:val="20"/>
-              </w:rPr>
-            </w:pPr>
-            <w:r>
-              <w:rPr>
-                <w:rFonts w:ascii="Arial" w:hAnsi="Arial" w:cs="Arial"/>
-                <w:b/>
-                <w:bCs/>
-                <w:sz w:val="20"/>
-                <w:szCs w:val="20"/>
-              </w:rPr>
-              <w:t>4</w:t>
-            </w:r>
-          </w:p>
-        </w:tc>
-        <w:tc>
-          <w:tcPr>
-            <w:tcW w:w="3570" w:type="dxa"/>
-            <w:tcBorders>
-              <w:top w:val="single" w:sz="4" w:space="0" w:color="auto"/>
-              <w:left w:val="single" w:sz="4" w:space="0" w:color="auto"/>
-              <w:bottom w:val="single" w:sz="4" w:space="0" w:color="auto"/>
-              <w:right w:val="single" w:sz="4" w:space="0" w:color="auto"/>
-            </w:tcBorders>
-            <w:hideMark/>
-          </w:tcPr>
-          <w:p>
-            <w:pPr>
-              <w:spacing w:after="160" w:line="259" w:lineRule="auto"/>
-              <w:rPr>
-                <w:rFonts w:ascii="Arial" w:hAnsi="Arial" w:cs="Arial"/>
-                <w:b/>
-                <w:bCs/>
-                <w:sz w:val="20"/>
-                <w:szCs w:val="20"/>
-              </w:rPr>
-            </w:pPr>
-            <w:r>
-              <w:rPr>
-                <w:rFonts w:ascii="Arial" w:hAnsi="Arial" w:cs="Arial"/>
-                <w:b/>
-                <w:bCs/>
-                <w:sz w:val="20"/>
-                <w:szCs w:val="20"/>
-              </w:rPr>
-              <w:t>User returns to Landing Page</w:t>
-            </w:r>
-          </w:p>
-        </w:tc>
-        <w:tc>
-          <w:tcPr>
-            <w:tcW w:w="3930" w:type="dxa"/>
-            <w:tcBorders>
-              <w:top w:val="single" w:sz="4" w:space="0" w:color="auto"/>
-              <w:left w:val="single" w:sz="4" w:space="0" w:color="auto"/>
-              <w:bottom w:val="single" w:sz="4" w:space="0" w:color="auto"/>
-              <w:right w:val="single" w:sz="4" w:space="0" w:color="auto"/>
-            </w:tcBorders>
-            <w:hideMark/>
-          </w:tcPr>
-          <w:p>
-            <w:pPr>
-              <w:spacing w:after="160" w:line="259" w:lineRule="auto"/>
-              <w:rPr>
-                <w:rFonts w:ascii="Arial" w:hAnsi="Arial" w:cs="Arial"/>
-                <w:b/>
-                <w:bCs/>
-                <w:sz w:val="20"/>
-                <w:szCs w:val="20"/>
-              </w:rPr>
-            </w:pPr>
-            <w:r>
-              <w:rPr>
-                <w:rFonts w:ascii="Arial" w:hAnsi="Arial" w:cs="Arial"/>
-                <w:b/>
-                <w:bCs/>
-                <w:sz w:val="20"/>
-                <w:szCs w:val="20"/>
-              </w:rPr>
-              <w:t>User returns to Landing page still logged in</w:t>
-            </w:r>
-          </w:p>
-        </w:tc>
-        <w:tc>
-          <w:tcPr>
-            <w:tcW w:w="2148" w:type="dxa"/>
-            <w:tcBorders>
-              <w:top w:val="single" w:sz="4" w:space="0" w:color="auto"/>
-              <w:left w:val="single" w:sz="4" w:space="0" w:color="auto"/>
-              <w:bottom w:val="single" w:sz="4" w:space="0" w:color="auto"/>
-              <w:right w:val="single" w:sz="4" w:space="0" w:color="auto"/>
-            </w:tcBorders>
-            <w:hideMark/>
-          </w:tcPr>
-          <w:p>
-            <w:pPr>
-              <w:spacing w:after="160" w:line="259" w:lineRule="auto"/>
-              <w:rPr>
-                <w:rFonts w:ascii="Arial" w:hAnsi="Arial" w:cs="Arial"/>
-                <w:b/>
-                <w:bCs/>
-                <w:sz w:val="20"/>
-                <w:szCs w:val="20"/>
-              </w:rPr>
-            </w:pPr>
-            <w:r>
-              <w:rPr>
-                <w:rFonts w:ascii="Arial" w:hAnsi="Arial" w:cs="Arial"/>
-                <w:b/>
-                <w:bCs/>
-                <w:sz w:val="20"/>
-                <w:szCs w:val="20"/>
-              </w:rPr>
-              <w:t>&lt;yes/no&gt;</w:t>
-            </w:r>
-          </w:p>
-        </w:tc>
-        <w:tc>
-          <w:tcPr>
-            <w:tcW w:w="2052" w:type="dxa"/>
-            <w:tcBorders>
-              <w:top w:val="single" w:sz="4" w:space="0" w:color="auto"/>
-              <w:left w:val="single" w:sz="4" w:space="0" w:color="auto"/>
-              <w:bottom w:val="single" w:sz="4" w:space="0" w:color="auto"/>
-              <w:right w:val="single" w:sz="4" w:space="0" w:color="auto"/>
-            </w:tcBorders>
-            <w:hideMark/>
-          </w:tcPr>
-          <w:p>
-            <w:pPr>
-              <w:spacing w:after="160" w:line="259" w:lineRule="auto"/>
-              <w:rPr>
-                <w:rFonts w:ascii="Arial" w:hAnsi="Arial" w:cs="Arial"/>
-                <w:b/>
-                <w:bCs/>
-                <w:sz w:val="20"/>
-                <w:szCs w:val="20"/>
-              </w:rPr>
-            </w:pPr>
-            <w:r>
-              <w:rPr>
-                <w:rFonts w:ascii="Arial" w:hAnsi="Arial" w:cs="Arial"/>
-                <w:b/>
-                <w:bCs/>
-                <w:sz w:val="20"/>
-                <w:szCs w:val="20"/>
-              </w:rPr>
-              <w:t>&lt;yes/no&gt;</w:t>
-            </w:r>
-          </w:p>
-        </w:tc>
-      </w:tr>
-      <w:tr>
-        <w:trPr>
-          <w:trHeight w:val="350"/>
-        </w:trPr>
-        <w:tc>
-          <w:tcPr>
-            <w:tcW w:w="1250" w:type="dxa"/>
-            <w:tcBorders>
-              <w:top w:val="single" w:sz="4" w:space="0" w:color="auto"/>
-              <w:left w:val="single" w:sz="4" w:space="0" w:color="auto"/>
-              <w:bottom w:val="single" w:sz="4" w:space="0" w:color="auto"/>
-              <w:right w:val="single" w:sz="4" w:space="0" w:color="auto"/>
-            </w:tcBorders>
-            <w:hideMark/>
-          </w:tcPr>
-          <w:p>
-            <w:pPr>
-              <w:spacing w:after="160" w:line="259" w:lineRule="auto"/>
-              <w:rPr>
-                <w:rFonts w:ascii="Arial" w:hAnsi="Arial" w:cs="Arial"/>
-                <w:b/>
-                <w:bCs/>
-                <w:sz w:val="20"/>
-                <w:szCs w:val="20"/>
-              </w:rPr>
-            </w:pPr>
-            <w:r>
-              <w:rPr>
-                <w:rFonts w:ascii="Arial" w:hAnsi="Arial" w:cs="Arial"/>
-                <w:b/>
-                <w:bCs/>
-                <w:sz w:val="20"/>
-                <w:szCs w:val="20"/>
-              </w:rPr>
-              <w:t>5</w:t>
-            </w:r>
-          </w:p>
-        </w:tc>
-        <w:tc>
-          <w:tcPr>
-            <w:tcW w:w="3570" w:type="dxa"/>
-            <w:tcBorders>
-              <w:top w:val="single" w:sz="4" w:space="0" w:color="auto"/>
-              <w:left w:val="single" w:sz="4" w:space="0" w:color="auto"/>
-              <w:bottom w:val="single" w:sz="4" w:space="0" w:color="auto"/>
-              <w:right w:val="single" w:sz="4" w:space="0" w:color="auto"/>
-            </w:tcBorders>
-            <w:hideMark/>
-          </w:tcPr>
-          <w:p>
-            <w:pPr>
-              <w:spacing w:after="160" w:line="259" w:lineRule="auto"/>
-              <w:rPr>
-                <w:rFonts w:ascii="Arial" w:hAnsi="Arial" w:cs="Arial"/>
-                <w:b/>
-                <w:bCs/>
-                <w:sz w:val="20"/>
-                <w:szCs w:val="20"/>
-              </w:rPr>
-            </w:pPr>
-            <w:r>
-              <w:rPr>
-                <w:rFonts w:ascii="Arial" w:hAnsi="Arial" w:cs="Arial"/>
-                <w:b/>
-                <w:bCs/>
-                <w:sz w:val="20"/>
-                <w:szCs w:val="20"/>
-              </w:rPr>
-              <w:t>User goes to account information</w:t>
-            </w:r>
-          </w:p>
-        </w:tc>
-        <w:tc>
-          <w:tcPr>
-            <w:tcW w:w="3930" w:type="dxa"/>
-            <w:tcBorders>
-              <w:top w:val="single" w:sz="4" w:space="0" w:color="auto"/>
-              <w:left w:val="single" w:sz="4" w:space="0" w:color="auto"/>
-              <w:bottom w:val="single" w:sz="4" w:space="0" w:color="auto"/>
-              <w:right w:val="single" w:sz="4" w:space="0" w:color="auto"/>
-            </w:tcBorders>
-            <w:hideMark/>
-          </w:tcPr>
-          <w:p>
-            <w:pPr>
-              <w:spacing w:after="160" w:line="259" w:lineRule="auto"/>
-              <w:rPr>
-                <w:rFonts w:ascii="Arial" w:hAnsi="Arial" w:cs="Arial"/>
-                <w:b/>
-                <w:bCs/>
-                <w:sz w:val="20"/>
-                <w:szCs w:val="20"/>
-              </w:rPr>
-            </w:pPr>
-            <w:r>
-              <w:rPr>
-                <w:rFonts w:ascii="Arial" w:hAnsi="Arial" w:cs="Arial"/>
-                <w:b/>
-                <w:bCs/>
-                <w:sz w:val="20"/>
-                <w:szCs w:val="20"/>
-              </w:rPr>
-              <w:t xml:space="preserve">User </w:t>
-            </w:r>
-            <w:proofErr w:type="gramStart"/>
-            <w:r>
-              <w:rPr>
-                <w:rFonts w:ascii="Arial" w:hAnsi="Arial" w:cs="Arial"/>
-                <w:b/>
-                <w:bCs/>
-                <w:sz w:val="20"/>
-                <w:szCs w:val="20"/>
-              </w:rPr>
-              <w:t>is able to</w:t>
-            </w:r>
-            <w:proofErr w:type="gramEnd"/>
-            <w:r>
-              <w:rPr>
-                <w:rFonts w:ascii="Arial" w:hAnsi="Arial" w:cs="Arial"/>
-                <w:b/>
-                <w:bCs/>
-                <w:sz w:val="20"/>
-                <w:szCs w:val="20"/>
-              </w:rPr>
-              <w:t xml:space="preserve"> see account information</w:t>
+            <w:r>
+              <w:rPr>
+                <w:rFonts w:ascii="Arial" w:hAnsi="Arial" w:cs="Arial"/>
+                <w:b/>
+                <w:bCs/>
+                <w:sz w:val="20"/>
+                <w:szCs w:val="20"/>
+              </w:rPr>
+              <w:t>User is able to see account information</w:t>
             </w:r>
           </w:p>
         </w:tc>
@@ -12612,6 +10610,7 @@
   <w:style w:type="character" w:default="1" w:styleId="DefaultParagraphFont">
     <w:name w:val="Default Paragraph Font"/>
     <w:uiPriority w:val="1"/>
+    <w:semiHidden/>
     <w:unhideWhenUsed/>
   </w:style>
   <w:style w:type="table" w:default="1" w:styleId="TableNormal">

</xml_diff>